<commit_message>
docs: corrige ortografia espanola (acentos y enie) en documentacion de creditos
</commit_message>
<xml_diff>
--- a/docs/Documentacion-Completa-Creditos.docx
+++ b/docs/Documentacion-Completa-Creditos.docx
@@ -12,7 +12,7 @@
           <w:color w:val="1F3A5F"/>
           <w:sz w:val="48"/>
         </w:rPr>
-        <w:t>Manual de Funcionamiento de los Creditos</w:t>
+        <w:t>Manual de Funcionamiento de los Créditos</w:t>
       </w:r>
     </w:p>
     <w:p>
@@ -24,7 +24,7 @@
           <w:color w:val="2E5A88"/>
           <w:sz w:val="26"/>
         </w:rPr>
-        <w:t>Creditos comerciales expresados en Unidad de Valor de Credito (UVC)</w:t>
+        <w:t>Créditos comerciales expresados en Unidad de Valor de Crédito (UVC)</w:t>
       </w:r>
     </w:p>
     <w:p>
@@ -36,9 +36,9 @@
           <w:color w:val="555555"/>
           <w:sz w:val="22"/>
         </w:rPr>
-        <w:t>Formulas de calculo  ·  Desglose de la cuota  ·  Mora  ·  Clasificacion de cartera</w:t>
+        <w:t>Fórmulas de cálculo  ·  Desglose de la cuota  ·  Mora  ·  Clasificación de cartera</w:t>
         <w:br/>
-        <w:t>Asientos contables  ·  Cancelacion anticipada  ·  Situaciones operativas</w:t>
+        <w:t>Asientos contables  ·  Cancelación anticipada  ·  Situaciones operativas</w:t>
       </w:r>
     </w:p>
     <w:p/>
@@ -51,9 +51,9 @@
           <w:color w:val="555555"/>
           <w:sz w:val="20"/>
         </w:rPr>
-        <w:t>Documentacion tecnica y funcional del Simulador de Credito</w:t>
+        <w:t>Documentación técnica y funcional del Simulador de Crédito</w:t>
         <w:br/>
-        <w:t>Version 1.0</w:t>
+        <w:t>Versión 1.0</w:t>
       </w:r>
     </w:p>
     <w:p/>
@@ -79,13 +79,13 @@
                 <w:color w:val="1B5E20"/>
                 <w:sz w:val="20"/>
               </w:rPr>
-              <w:t xml:space="preserve">Para quien es este documento:  </w:t>
+              <w:t xml:space="preserve">¿Para quién es este documento?  </w:t>
             </w:r>
             <w:r>
               <w:rPr>
                 <w:sz w:val="20"/>
               </w:rPr>
-              <w:t>negocio, contabilidad, auditoria y desarrollo. Explica de la forma mas simple posible como debe funcionar un credito de principio a fin: desde el desembolso hasta el ultimo pago, pasando por la mora, la clasificacion de riesgo y los asientos contables. Cada numero del simulador puede rastrearse hasta su formula y su fundamento.</w:t>
+              <w:t>Para negocio, contabilidad, auditoría y desarrollo. Explica de la forma más simple posible cómo debe funcionar un crédito de principio a fin: desde el desembolso hasta el último pago, pasando por la mora, la clasificación de riesgo y los asientos contables. Cada número del simulador puede rastrearse hasta su fórmula y su fundamento.</w:t>
             </w:r>
           </w:p>
         </w:tc>
@@ -104,17 +104,17 @@
         <w:rPr>
           <w:color w:val="2E5A88"/>
         </w:rPr>
-        <w:t>Como leer este documento</w:t>
+        <w:t>Cómo leer este documento</w:t>
       </w:r>
     </w:p>
     <w:p>
       <w:r>
-        <w:t>Todas las formulas se muestran en bloques de color morado y con tipografia monoespaciada. Los terminos clave (UVC, IDI, mora, etc.) se definen en el Glosario al final. Donde es util, se incluye un ejemplo numerico resaltado en una caja de color.</w:t>
+        <w:t>Todas las fórmulas se muestran en bloques de color morado y con tipografía monoespaciada. Los términos clave (UVC, IDI, mora, etc.) se definen en el Glosario al final. Donde es útil, se incluye un ejemplo numérico resaltado en una caja de color.</w:t>
       </w:r>
     </w:p>
     <w:p>
       <w:r>
-        <w:t>Las cifras de los ejemplos toman como base el caso por defecto del simulador (la tabla de amortizacion de referencia): capital 160.000 Bs, IDI de desembolso 0,98495915, plazo 12 meses, tasa 16% anual y mora 3% anual.</w:t>
+        <w:t>Las cifras de los ejemplos toman como base el caso por defecto del simulador (la tabla de amortización de referencia): capital 160.000 Bs, IDI de desembolso 0,98495915, plazo 12 meses, tasa 16 % anual y mora 3 % anual.</w:t>
       </w:r>
     </w:p>
     <w:p>
@@ -138,7 +138,7 @@
         <w:spacing w:after="40"/>
       </w:pPr>
       <w:r>
-        <w:t>1. Que es un credito UVC (en palabras simples)</w:t>
+        <w:t>1. Qué es un crédito UVC (en palabras simples)</w:t>
       </w:r>
     </w:p>
     <w:p>
@@ -154,7 +154,7 @@
         <w:spacing w:after="40"/>
       </w:pPr>
       <w:r>
-        <w:t>3. Unidad de Valor de Credito (UVC) e Indice de Inversion (IDI)</w:t>
+        <w:t>3. Unidad de Valor de Crédito (UVC) e Índice de Inversión (IDI)</w:t>
       </w:r>
     </w:p>
     <w:p>
@@ -162,7 +162,7 @@
         <w:spacing w:after="40"/>
       </w:pPr>
       <w:r>
-        <w:t>4. El Indice de Inversion dia a dia: como se resuelve cada fecha</w:t>
+        <w:t>4. El Índice de Inversión día a día: cómo se resuelve cada fecha</w:t>
       </w:r>
     </w:p>
     <w:p>
@@ -170,7 +170,7 @@
         <w:spacing w:after="40"/>
       </w:pPr>
       <w:r>
-        <w:t>5. Parametros que definen un credito</w:t>
+        <w:t>5. Parámetros que definen un crédito</w:t>
       </w:r>
     </w:p>
     <w:p>
@@ -178,7 +178,7 @@
         <w:spacing w:after="40"/>
       </w:pPr>
       <w:r>
-        <w:t>6. Sistema de amortizacion frances (cuota fija en UVC)</w:t>
+        <w:t>6. Sistema de amortización francés (cuota fija en UVC)</w:t>
       </w:r>
     </w:p>
     <w:p>
@@ -186,7 +186,7 @@
         <w:spacing w:after="40"/>
       </w:pPr>
       <w:r>
-        <w:t>7. Base de dias (30/360 y actual/365)</w:t>
+        <w:t>7. Base de días (30/360 y actual/365)</w:t>
       </w:r>
     </w:p>
     <w:p>
@@ -194,7 +194,7 @@
         <w:spacing w:after="40"/>
       </w:pPr>
       <w:r>
-        <w:t>8. Valoracion de intereses: IDI al vencimiento vs. IDI diario</w:t>
+        <w:t>8. Valoración de intereses: IDI al vencimiento vs. IDI diario</w:t>
       </w:r>
     </w:p>
     <w:p>
@@ -202,7 +202,7 @@
         <w:spacing w:after="40"/>
       </w:pPr>
       <w:r>
-        <w:t>9. Desglose de la cuota en bolivares (base, variacion y valorizacion UVC)</w:t>
+        <w:t>9. Desglose de la cuota en bolívares (base, variación y valorización UVC)</w:t>
       </w:r>
     </w:p>
     <w:p>
@@ -210,7 +210,7 @@
         <w:spacing w:after="40"/>
       </w:pPr>
       <w:r>
-        <w:t>10. Saldo del credito</w:t>
+        <w:t>10. Saldo del crédito</w:t>
       </w:r>
     </w:p>
     <w:p>
@@ -218,7 +218,7 @@
         <w:spacing w:after="40"/>
       </w:pPr>
       <w:r>
-        <w:t>11. Mora: cuando, cuanto y sobre que se cobra</w:t>
+        <w:t>11. Mora: cuándo, cuánto y sobre qué se cobra</w:t>
       </w:r>
     </w:p>
     <w:p>
@@ -226,7 +226,7 @@
         <w:spacing w:after="40"/>
       </w:pPr>
       <w:r>
-        <w:t>12. Orden de imputacion de los pagos</w:t>
+        <w:t>12. Orden de imputación de los pagos</w:t>
       </w:r>
     </w:p>
     <w:p>
@@ -234,7 +234,7 @@
         <w:spacing w:after="40"/>
       </w:pPr>
       <w:r>
-        <w:t>13. Clasificacion de la cartera de creditos</w:t>
+        <w:t>13. Clasificación de la cartera de créditos</w:t>
       </w:r>
     </w:p>
     <w:p>
@@ -250,7 +250,7 @@
         <w:spacing w:after="40"/>
       </w:pPr>
       <w:r>
-        <w:t>15. Congelamiento del credito vencido</w:t>
+        <w:t>15. Congelamiento del crédito vencido</w:t>
       </w:r>
     </w:p>
     <w:p>
@@ -258,7 +258,7 @@
         <w:spacing w:after="40"/>
       </w:pPr>
       <w:r>
-        <w:t>16. Cancelacion anticipada y prepagos</w:t>
+        <w:t>16. Cancelación anticipada y prepagos</w:t>
       </w:r>
     </w:p>
     <w:p>
@@ -282,7 +282,7 @@
         <w:spacing w:after="40"/>
       </w:pPr>
       <w:r>
-        <w:t>19. Ajuste a dias habiles y feriados</w:t>
+        <w:t>19. Ajuste a días hábiles y feriados</w:t>
       </w:r>
     </w:p>
     <w:p>
@@ -290,7 +290,7 @@
         <w:spacing w:after="40"/>
       </w:pPr>
       <w:r>
-        <w:t>20. Comision flat y cumplimiento regulatorio</w:t>
+        <w:t>20. Comisión flat y cumplimiento regulatorio</w:t>
       </w:r>
     </w:p>
     <w:p>
@@ -306,7 +306,7 @@
         <w:spacing w:after="40"/>
       </w:pPr>
       <w:r>
-        <w:t>22. Modo libre vs. modo simulacion</w:t>
+        <w:t>22. Modo libre vs. modo simulación</w:t>
       </w:r>
     </w:p>
     <w:p>
@@ -314,7 +314,7 @@
         <w:spacing w:after="40"/>
       </w:pPr>
       <w:r>
-        <w:t>23. Catalogo de situaciones y escenarios</w:t>
+        <w:t>23. Catálogo de situaciones y escenarios</w:t>
       </w:r>
     </w:p>
     <w:p>
@@ -322,7 +322,7 @@
         <w:spacing w:after="40"/>
       </w:pPr>
       <w:r>
-        <w:t>24. Resumen de todas las formulas (hoja de referencia)</w:t>
+        <w:t>24. Resumen de todas las fórmulas (hoja de referencia)</w:t>
       </w:r>
     </w:p>
     <w:p>
@@ -346,12 +346,12 @@
         <w:rPr>
           <w:color w:val="1F3A5F"/>
         </w:rPr>
-        <w:t>1. Que es un credito UVC (en palabras simples)</w:t>
+        <w:t>1. Qué es un crédito UVC (en palabras simples)</w:t>
       </w:r>
     </w:p>
     <w:p>
       <w:r>
-        <w:t>Un credito UVC es un prestamo en bolivares cuyo valor se 'guarda' en una unidad estable llamada Unidad de Valor de Credito (UVC), para que la inflacion no licue el capital prestado. Funciona en tres pasos:</w:t>
+        <w:t>Un crédito UVC es un préstamo en bolívares cuyo valor se «guarda» en una unidad estable llamada Unidad de Valor de Crédito (UVC), para que la inflación no licúe el capital prestado. Funciona en tres pasos:</w:t>
       </w:r>
     </w:p>
     <w:p>
@@ -359,7 +359,7 @@
         <w:pStyle w:val="ListNumber"/>
       </w:pPr>
       <w:r>
-        <w:t>Al desembolsar, el monto en bolivares se convierte a UVC usando el Indice de Inversion (IDI) del dia. Esa cantidad de UVC es la deuda 'real'.</w:t>
+        <w:t>Al desembolsar, el monto en bolívares se convierte a UVC usando el Índice de Inversión (IDI) del día. Esa cantidad de UVC es la deuda «real».</w:t>
       </w:r>
     </w:p>
     <w:p>
@@ -367,7 +367,7 @@
         <w:pStyle w:val="ListNumber"/>
       </w:pPr>
       <w:r>
-        <w:t>Durante la vida del credito, la deuda se lleva en UVC: los intereses, la amortizacion y el saldo se calculan en UVC con una cuota fija (sistema frances).</w:t>
+        <w:t>Durante la vida del crédito, la deuda se lleva en UVC: los intereses, la amortización y el saldo se calculan en UVC con una cuota fija (sistema francés).</w:t>
       </w:r>
     </w:p>
     <w:p>
@@ -375,7 +375,7 @@
         <w:pStyle w:val="ListNumber"/>
       </w:pPr>
       <w:r>
-        <w:t>Cada vez que hay que cobrar o contabilizar, las UVC se vuelven a expresar en bolivares multiplicando por el IDI de esa fecha. Como el IDI sube con la inflacion, el banco recupera el poder adquisitivo y el cliente paga el valor real.</w:t>
+        <w:t>Cada vez que hay que cobrar o contabilizar, las UVC se vuelven a expresar en bolívares multiplicando por el IDI de esa fecha. Como el IDI sube con la inflación, el banco recupera el poder adquisitivo y el cliente paga el valor real.</w:t>
       </w:r>
     </w:p>
     <w:tbl>
@@ -406,7 +406,7 @@
               <w:rPr>
                 <w:sz w:val="20"/>
               </w:rPr>
-              <w:t>el credito 'vive' en UVC (valor estable) y solo se 'traduce' a bolivares en el momento de pagar o contabilizar, usando el IDI de cada fecha.</w:t>
+              <w:t>el crédito «vive» en UVC (valor estable) y solo se «traduce» a bolívares en el momento de pagar o contabilizar, usando el IDI de cada fecha.</w:t>
             </w:r>
           </w:p>
         </w:tc>
@@ -419,7 +419,7 @@
     </w:p>
     <w:p>
       <w:r>
-        <w:t>Si el credito NO es UVC (parametro creditUvc desactivado), todo el calculo se hace directamente en bolivares: el IDI se trata como 1 y desaparecen los componentes de actualizacion. El resto del modelo (cuota francesa, mora, clasificacion, asientos) es igual.</w:t>
+        <w:t>Si el crédito NO es UVC (parámetro creditUvc desactivado), todo el cálculo se hace directamente en bolívares: el IDI se trata como 1 y desaparecen los componentes de actualización. El resto del modelo (cuota francesa, mora, clasificación, asientos) es igual.</w:t>
       </w:r>
     </w:p>
     <w:p>
@@ -435,7 +435,7 @@
     </w:p>
     <w:p>
       <w:r>
-        <w:t>El modelo implementa la normativa venezolana sobre creditos comerciales en UVC. Los instrumentos principales son:</w:t>
+        <w:t>El modelo implementa la normativa venezolana sobre créditos comerciales en UVC. Los instrumentos principales son:</w:t>
       </w:r>
     </w:p>
     <w:tbl>
@@ -498,7 +498,7 @@
                 <w:color w:val="FFFFFF"/>
                 <w:sz w:val="19"/>
               </w:rPr>
-              <w:t>Que aporta al modelo</w:t>
+              <w:t>Qué aporta al modelo</w:t>
             </w:r>
           </w:p>
         </w:tc>
@@ -514,7 +514,7 @@
               <w:rPr>
                 <w:sz w:val="19"/>
               </w:rPr>
-              <w:t>Resolucion BCV N° 19-09-01</w:t>
+              <w:t>Resolución BCV N.° 19-09-01</w:t>
             </w:r>
           </w:p>
         </w:tc>
@@ -542,7 +542,7 @@
               <w:rPr>
                 <w:sz w:val="19"/>
               </w:rPr>
-              <w:t>Crea la obligacion de expresar los creditos comerciales en UVC y dividir el monto en Bs entre el IDI del otorgamiento.</w:t>
+              <w:t>Crea la obligación de expresar los créditos comerciales en UVC y dividir el monto en Bs entre el IDI del otorgamiento.</w:t>
             </w:r>
           </w:p>
         </w:tc>
@@ -586,7 +586,7 @@
               <w:rPr>
                 <w:sz w:val="19"/>
               </w:rPr>
-              <w:t>Comision flat maxima de 0,50% del monto del credito.</w:t>
+              <w:t>Comisión flat máxima de 0,50 % del monto del crédito.</w:t>
             </w:r>
           </w:p>
         </w:tc>
@@ -630,7 +630,7 @@
               <w:rPr>
                 <w:sz w:val="19"/>
               </w:rPr>
-              <w:t>Aplica la Resolucion 19-09-01 desde el 28/10/2019.</w:t>
+              <w:t>Aplica la Resolución 19-09-01 desde el 28/10/2019.</w:t>
             </w:r>
           </w:p>
         </w:tc>
@@ -674,7 +674,7 @@
               <w:rPr>
                 <w:sz w:val="19"/>
               </w:rPr>
-              <w:t>Clausulas minimas del contrato: amortizacion de capital en UVC, cancelacion anticipada con piso de IDI, % de mora.</w:t>
+              <w:t>Cláusulas mínimas del contrato: amortización de capital en UVC, cancelación anticipada con piso de IDI, % de mora.</w:t>
             </w:r>
           </w:p>
         </w:tc>
@@ -762,7 +762,7 @@
               <w:rPr>
                 <w:sz w:val="19"/>
               </w:rPr>
-              <w:t>Tratamiento del credito vencido: congelamiento y registro en cuentas de orden / patrimonio (358.00).</w:t>
+              <w:t>Tratamiento del crédito vencido: congelamiento y registro en cuentas de orden / patrimonio (358.00).</w:t>
             </w:r>
           </w:p>
         </w:tc>
@@ -778,7 +778,7 @@
               <w:rPr>
                 <w:sz w:val="19"/>
               </w:rPr>
-              <w:t>Resolucion BCV N° 21-01-02 (VIGENTE)</w:t>
+              <w:t>Resolución BCV N.° 21-01-02 (VIGENTE)</w:t>
             </w:r>
           </w:p>
         </w:tc>
@@ -806,7 +806,7 @@
               <w:rPr>
                 <w:sz w:val="19"/>
               </w:rPr>
-              <w:t>Norma actual: define UVC, IDI, tasas 4%-10% (2% Cartera Productiva), mora maxima 0,80%, piso de IDI en cancelacion anticipada.</w:t>
+              <w:t>Norma actual: define UVC, IDI, tasas 4 %-10 % (2 % Cartera Productiva), mora máxima 0,80 %, piso de IDI en cancelación anticipada.</w:t>
             </w:r>
           </w:p>
         </w:tc>
@@ -845,7 +845,7 @@
               <w:rPr>
                 <w:sz w:val="20"/>
               </w:rPr>
-              <w:t>las resoluciones se actualizan con frecuencia. Antes de usar en produccion, verifique las versiones vigentes en bcv.org.ve y sudeban.gob.ve.</w:t>
+              <w:t>las resoluciones se actualizan con frecuencia. Antes de usar en producción, verifique las versiones vigentes en bcv.org.ve y sudeban.gob.ve.</w:t>
             </w:r>
           </w:p>
         </w:tc>
@@ -864,12 +864,12 @@
         <w:rPr>
           <w:color w:val="1F3A5F"/>
         </w:rPr>
-        <w:t>3. Unidad de Valor de Credito (UVC) e Indice de Inversion (IDI)</w:t>
+        <w:t>3. Unidad de Valor de Crédito (UVC) e Índice de Inversión (IDI)</w:t>
       </w:r>
     </w:p>
     <w:p>
       <w:r>
-        <w:t>La UVC es una unidad de cuenta creada por el BCV para preservar el valor real del credito. El IDI (Indice de Inversion) es un factor que el BCV publica diariamente y que indica cuantos bolivares vale una UVC en una fecha determinada. Refleja la variacion del tipo de cambio de referencia de mercado.</w:t>
+        <w:t>La UVC es una unidad de cuenta creada por el BCV para preservar el valor real del crédito. El IDI (Índice de Inversión) es un factor que el BCV publica diariamente y que indica cuántos bolívares vale una UVC en una fecha determinada. Refleja la variación del tipo de cambio de referencia de mercado.</w:t>
       </w:r>
     </w:p>
     <w:p>
@@ -880,12 +880,12 @@
         <w:rPr>
           <w:color w:val="2E5A88"/>
         </w:rPr>
-        <w:t>3.1 Conversion del capital al desembolsar</w:t>
+        <w:t>3.1 Conversión del capital al desembolsar</w:t>
       </w:r>
     </w:p>
     <w:p>
       <w:r>
-        <w:t>El monto entregado en bolivares se convierte a UVC con el IDI del dia del desembolso. Ese IDI de otorgamiento queda fijo para toda la vida del credito (es la referencia 'base').</w:t>
+        <w:t>El monto entregado en bolívares se convierte a UVC con el IDI del día del desembolso. Ese IDI de otorgamiento queda fijo para toda la vida del crédito (es la referencia «base»).</w:t>
       </w:r>
     </w:p>
     <w:p>
@@ -949,7 +949,7 @@
         <w:rPr>
           <w:color w:val="2E5A88"/>
         </w:rPr>
-        <w:t>3.2 Conversion de UVC a bolivares en cualquier fecha</w:t>
+        <w:t>3.2 Conversión de UVC a bolívares en cualquier fecha</w:t>
       </w:r>
     </w:p>
     <w:p>
@@ -968,7 +968,7 @@
     </w:p>
     <w:p>
       <w:r>
-        <w:t>Esta es la regla que se usa para expresar en bolivares la cuota, los intereses, la amortizacion y el saldo en cualquier momento.</w:t>
+        <w:t>Esta es la regla que se usa para expresar en bolívares la cuota, los intereses, la amortización y el saldo en cualquier momento.</w:t>
       </w:r>
     </w:p>
     <w:p>
@@ -979,12 +979,12 @@
         <w:rPr>
           <w:color w:val="1F3A5F"/>
         </w:rPr>
-        <w:t>4. El Indice de Inversion dia a dia: como se resuelve cada fecha</w:t>
+        <w:t>4. El Índice de Inversión día a día: cómo se resuelve cada fecha</w:t>
       </w:r>
     </w:p>
     <w:p>
       <w:r>
-        <w:t>El BCV no publica IDI todos los dias (no hay fines de semana ni feriados). El sistema (funcion createIdiResolver) resuelve el IDI de cualquier fecha asi:</w:t>
+        <w:t>El BCV no publica IDI todos los días (no hay fines de semana ni feriados). El sistema (función createIdiResolver) resuelve el IDI de cualquier fecha así:</w:t>
       </w:r>
     </w:p>
     <w:tbl>
@@ -1012,7 +1012,7 @@
                 <w:color w:val="FFFFFF"/>
                 <w:sz w:val="19"/>
               </w:rPr>
-              <w:t>Situacion de la fecha</w:t>
+              <w:t>Situación de la fecha</w:t>
             </w:r>
           </w:p>
         </w:tc>
@@ -1029,7 +1029,7 @@
                 <w:color w:val="FFFFFF"/>
                 <w:sz w:val="19"/>
               </w:rPr>
-              <w:t>Que IDI se usa</w:t>
+              <w:t>Qué IDI se usa</w:t>
             </w:r>
           </w:p>
         </w:tc>
@@ -1075,7 +1075,7 @@
               <w:rPr>
                 <w:sz w:val="19"/>
               </w:rPr>
-              <w:t>Fin de semana (sabado/domingo)</w:t>
+              <w:t>Fin de semana (sábado/domingo)</w:t>
             </w:r>
           </w:p>
         </w:tc>
@@ -1089,7 +1089,7 @@
               <w:rPr>
                 <w:sz w:val="19"/>
               </w:rPr>
-              <w:t>Se usa el IDI del ultimo dia habil previo (el IDI no cambia en fin de semana).</w:t>
+              <w:t>Se usa el IDI del último día hábil previo (el IDI no cambia en fin de semana).</w:t>
             </w:r>
           </w:p>
         </w:tc>
@@ -1119,7 +1119,7 @@
               <w:rPr>
                 <w:sz w:val="19"/>
               </w:rPr>
-              <w:t>Se arrastra el ultimo IDI conocido (o se interpola, segun el parametro idiMissing).</w:t>
+              <w:t>Se arrastra el último IDI conocido (o se interpola, según el parámetro idiMissing).</w:t>
             </w:r>
           </w:p>
         </w:tc>
@@ -1149,7 +1149,7 @@
               <w:rPr>
                 <w:sz w:val="19"/>
               </w:rPr>
-              <w:t>Se extrapola: ultimo IDI + (paso diario idiFutureStep x dias futuros).</w:t>
+              <w:t>Se extrapola: último IDI + (paso diario idiFutureStep x días futuros).</w:t>
             </w:r>
           </w:p>
         </w:tc>
@@ -1209,7 +1209,7 @@
               <w:rPr>
                 <w:sz w:val="19"/>
               </w:rPr>
-              <w:t>Se usa el IDI por defecto (parametro idi).</w:t>
+              <w:t>Se usa el IDI por defecto (parámetro idi).</w:t>
             </w:r>
           </w:p>
         </w:tc>
@@ -1222,7 +1222,7 @@
     </w:p>
     <w:p>
       <w:r>
-        <w:t>Cada fila del calendario marca el origen del IDI ('BCV' cuando deriva de un dato real hasta hoy, o 'invented' cuando es una extrapolacion futura), util para auditoria.</w:t>
+        <w:t>Cada fila del calendario marca el origen del IDI («BCV» cuando deriva de un dato real hasta hoy, o «invented» cuando es una extrapolación futura), útil para auditoría.</w:t>
       </w:r>
     </w:p>
     <w:tbl>
@@ -1247,13 +1247,13 @@
                 <w:color w:val="1F3A5F"/>
                 <w:sz w:val="20"/>
               </w:rPr>
-              <w:t xml:space="preserve">Por que importa:  </w:t>
+              <w:t xml:space="preserve">Por qué importa:  </w:t>
             </w:r>
             <w:r>
               <w:rPr>
                 <w:sz w:val="20"/>
               </w:rPr>
-              <w:t>el IDI elegido para cada fecha afecta directamente los bolivares de intereses, amortizacion, mora y saldo. Por eso el origen del dato (real vs. estimado) se hace visible.</w:t>
+              <w:t>el IDI elegido para cada fecha afecta directamente los bolívares de intereses, amortización, mora y saldo. Por eso el origen del dato (real vs. estimado) se hace visible.</w:t>
             </w:r>
           </w:p>
         </w:tc>
@@ -1272,12 +1272,12 @@
         <w:rPr>
           <w:color w:val="1F3A5F"/>
         </w:rPr>
-        <w:t>5. Parametros que definen un credito</w:t>
+        <w:t>5. Parámetros que definen un crédito</w:t>
       </w:r>
     </w:p>
     <w:p>
       <w:r>
-        <w:t>Un credito se configura con los siguientes parametros (los valores por defecto reproducen la tabla de amortizacion de referencia):</w:t>
+        <w:t>Un crédito se configura con los siguientes parámetros (los valores por defecto reproducen la tabla de amortización de referencia):</w:t>
       </w:r>
     </w:p>
     <w:tbl>
@@ -1306,7 +1306,7 @@
                 <w:color w:val="FFFFFF"/>
                 <w:sz w:val="18"/>
               </w:rPr>
-              <w:t>Parametro</w:t>
+              <w:t>Parámetro</w:t>
             </w:r>
           </w:p>
         </w:tc>
@@ -1323,7 +1323,7 @@
                 <w:color w:val="FFFFFF"/>
                 <w:sz w:val="18"/>
               </w:rPr>
-              <w:t>Que significa</w:t>
+              <w:t>Qué significa</w:t>
             </w:r>
           </w:p>
         </w:tc>
@@ -1370,7 +1370,7 @@
               <w:rPr>
                 <w:sz w:val="18"/>
               </w:rPr>
-              <w:t>Capital desembolsado en bolivares</w:t>
+              <w:t>Capital desembolsado en bolívares</w:t>
             </w:r>
           </w:p>
         </w:tc>
@@ -1414,7 +1414,7 @@
               <w:rPr>
                 <w:sz w:val="18"/>
               </w:rPr>
-              <w:t>Tasa de interes anual (%)</w:t>
+              <w:t>Tasa de interés anual (%)</w:t>
             </w:r>
           </w:p>
         </w:tc>
@@ -1458,7 +1458,7 @@
               <w:rPr>
                 <w:sz w:val="18"/>
               </w:rPr>
-              <w:t>Plazo en meses (numero de cuotas)</w:t>
+              <w:t>Plazo en meses (número de cuotas)</w:t>
             </w:r>
           </w:p>
         </w:tc>
@@ -1546,7 +1546,7 @@
               <w:rPr>
                 <w:sz w:val="18"/>
               </w:rPr>
-              <w:t>Fecha de vencimiento de la 1a cuota</w:t>
+              <w:t>Fecha de vencimiento de la 1.ª cuota</w:t>
             </w:r>
           </w:p>
         </w:tc>
@@ -1590,7 +1590,7 @@
               <w:rPr>
                 <w:sz w:val="18"/>
               </w:rPr>
-              <w:t>IDI del dia de desembolso (referencia base)</w:t>
+              <w:t>IDI del día de desembolso (referencia base)</w:t>
             </w:r>
           </w:p>
         </w:tc>
@@ -1634,7 +1634,7 @@
               <w:rPr>
                 <w:sz w:val="18"/>
               </w:rPr>
-              <w:t>Comision flat de desembolso (%)</w:t>
+              <w:t>Comisión flat de desembolso (%)</w:t>
             </w:r>
           </w:p>
         </w:tc>
@@ -1678,7 +1678,7 @@
               <w:rPr>
                 <w:sz w:val="18"/>
               </w:rPr>
-              <w:t>Convencion de dias: 30/360 o actual/365</w:t>
+              <w:t>Convención de días: 30/360 o actual/365</w:t>
             </w:r>
           </w:p>
         </w:tc>
@@ -1722,7 +1722,7 @@
               <w:rPr>
                 <w:sz w:val="18"/>
               </w:rPr>
-              <w:t>Valoracion del interes: idi_due o idi_daily</w:t>
+              <w:t>Valoración del interés: idi_due o idi_daily</w:t>
             </w:r>
           </w:p>
         </w:tc>
@@ -1898,7 +1898,7 @@
               <w:rPr>
                 <w:sz w:val="18"/>
               </w:rPr>
-              <w:t>Dias de gracia antes de generar mora</w:t>
+              <w:t>Días de gracia antes de generar mora</w:t>
             </w:r>
           </w:p>
         </w:tc>
@@ -1986,7 +1986,7 @@
               <w:rPr>
                 <w:sz w:val="18"/>
               </w:rPr>
-              <w:t>Umbrales de clasificacion (dias)</w:t>
+              <w:t>Umbrales de clasificación (días)</w:t>
             </w:r>
           </w:p>
         </w:tc>
@@ -2030,7 +2030,7 @@
               <w:rPr>
                 <w:sz w:val="18"/>
               </w:rPr>
-              <w:t>Activa la denominacion en UVC</w:t>
+              <w:t>Activa la denominación en UVC</w:t>
             </w:r>
           </w:p>
         </w:tc>
@@ -2074,7 +2074,7 @@
               <w:rPr>
                 <w:sz w:val="18"/>
               </w:rPr>
-              <w:t>Piso de IDI en cancelacion anticipada</w:t>
+              <w:t>Piso de IDI en cancelación anticipada</w:t>
             </w:r>
           </w:p>
         </w:tc>
@@ -2118,7 +2118,7 @@
               <w:rPr>
                 <w:sz w:val="18"/>
               </w:rPr>
-              <w:t>Modo referencia: admite tasas historicas sin bloquear</w:t>
+              <w:t>Modo referencia: admite tasas históricas sin bloquear</w:t>
             </w:r>
           </w:p>
         </w:tc>
@@ -2250,7 +2250,7 @@
               <w:rPr>
                 <w:sz w:val="18"/>
               </w:rPr>
-              <w:t>Politica de prepago: reduce_term o reduce_installment</w:t>
+              <w:t>Política de prepago: reduce_term o reduce_installment</w:t>
             </w:r>
           </w:p>
         </w:tc>
@@ -2294,7 +2294,7 @@
               <w:rPr>
                 <w:sz w:val="18"/>
               </w:rPr>
-              <w:t>Mueve vencimientos a dia habil siguiente</w:t>
+              <w:t>Mueve vencimientos a día hábil siguiente</w:t>
             </w:r>
           </w:p>
         </w:tc>
@@ -2338,7 +2338,7 @@
               <w:rPr>
                 <w:sz w:val="18"/>
               </w:rPr>
-              <w:t>Lista de feriados (YYYY-MM-DD)</w:t>
+              <w:t>Lista de feriados (AAAA-MM-DD)</w:t>
             </w:r>
           </w:p>
         </w:tc>
@@ -2382,7 +2382,7 @@
               <w:rPr>
                 <w:sz w:val="18"/>
               </w:rPr>
-              <w:t>libre (pagos reales) o simulacion (con 'hoy' simulado)</w:t>
+              <w:t>libre (pagos reales) o simulación (con «hoy» simulado)</w:t>
             </w:r>
           </w:p>
         </w:tc>
@@ -2415,12 +2415,12 @@
         <w:rPr>
           <w:color w:val="1F3A5F"/>
         </w:rPr>
-        <w:t>6. Sistema de amortizacion frances (cuota fija en UVC)</w:t>
+        <w:t>6. Sistema de amortización francés (cuota fija en UVC)</w:t>
       </w:r>
     </w:p>
     <w:p>
       <w:r>
-        <w:t>La norma exige que cada cuota incluya intereses y una porcion de amortizacion de capital expresada en UVC. El sistema usa amortizacion francesa: la cuota en UVC es fija durante todo el plazo. Es el metodo mas transparente porque el cliente conoce su cuota desde el inicio.</w:t>
+        <w:t>La norma exige que cada cuota incluya intereses y una porción de amortización de capital expresada en UVC. El sistema usa amortización francesa: la cuota en UVC es fija durante todo el plazo. Es el método más transparente porque el cliente conoce su cuota desde el inicio.</w:t>
       </w:r>
     </w:p>
     <w:p>
@@ -2431,7 +2431,7 @@
         <w:rPr>
           <w:color w:val="2E5A88"/>
         </w:rPr>
-        <w:t>6.1 Formula de la cuota fija</w:t>
+        <w:t>6.1 Fórmula de la cuota fija</w:t>
       </w:r>
     </w:p>
     <w:p>
@@ -2449,7 +2449,7 @@
         <w:br/>
         <w:t>Cuota_UVC = Capital_UVC x [ i / (1 - (1 + i)^(-n)) ]</w:t>
         <w:br/>
-        <w:t xml:space="preserve">   n = numero de cuotas (meses)</w:t>
+        <w:t xml:space="preserve">   n = número de cuotas (meses)</w:t>
       </w:r>
     </w:p>
     <w:p>
@@ -2460,7 +2460,7 @@
         <w:t xml:space="preserve">Caso especial - tasa cero: </w:t>
       </w:r>
       <w:r>
-        <w:t>si la tasa es 0, la cuota es simplemente el capital dividido entre el numero de cuotas:</w:t>
+        <w:t>si la tasa es 0, la cuota es simplemente el capital dividido entre el número de cuotas:</w:t>
       </w:r>
     </w:p>
     <w:p>
@@ -2485,12 +2485,12 @@
         <w:rPr>
           <w:color w:val="2E5A88"/>
         </w:rPr>
-        <w:t>6.2 Descomposicion de cada cuota</w:t>
+        <w:t>6.2 Descomposición de cada cuota</w:t>
       </w:r>
     </w:p>
     <w:p>
       <w:r>
-        <w:t>En cada periodo se calcula primero el interes y luego la amortizacion es el resto de la cuota:</w:t>
+        <w:t>En cada período se calcula primero el interés y luego la amortización es el resto de la cuota:</w:t>
       </w:r>
     </w:p>
     <w:p>
@@ -2515,7 +2515,7 @@
     </w:p>
     <w:p>
       <w:r>
-        <w:t>Propiedad garantizada del metodo frances: la amortizacion crece y el interes decrece cada periodo, de modo que el saldo en UVC llega a cero en la ultima cuota.</w:t>
+        <w:t>Propiedad garantizada del método francés: la amortización crece y el interés decrece cada período, de modo que el saldo en UVC llega a cero en la última cuota.</w:t>
       </w:r>
     </w:p>
     <w:p>
@@ -2526,12 +2526,12 @@
         <w:rPr>
           <w:color w:val="2E5A88"/>
         </w:rPr>
-        <w:t>6.3 La ultima cuota cierra el saldo</w:t>
+        <w:t>6.3 La última cuota cierra el saldo</w:t>
       </w:r>
     </w:p>
     <w:p>
       <w:r>
-        <w:t>En el ultimo periodo, la amortizacion se fuerza a igualar exactamente el saldo pendiente y la cuota se recalcula como interes + ese saldo. Asi se evita que queden centimos de UVC sin amortizar por redondeo.</w:t>
+        <w:t>En el último período, la amortización se fuerza a igualar exactamente el saldo pendiente y la cuota se recalcula como interés + ese saldo. Así se evita que queden céntimos de UVC sin amortizar por redondeo.</w:t>
       </w:r>
     </w:p>
     <w:p>
@@ -2578,7 +2578,7 @@
               <w:rPr>
                 <w:sz w:val="20"/>
               </w:rPr>
-              <w:t>si por algun calculo la amortizacion diera negativa, se fija en 0 (la cuota nunca aumenta el capital: no hay anatocismo).</w:t>
+              <w:t>si por algún cálculo la amortización diera negativa, se fija en 0 (la cuota nunca aumenta el capital: no hay anatocismo).</w:t>
             </w:r>
           </w:p>
         </w:tc>
@@ -2597,12 +2597,12 @@
         <w:rPr>
           <w:color w:val="1F3A5F"/>
         </w:rPr>
-        <w:t>7. Base de dias (30/360 y actual/365)</w:t>
+        <w:t>7. Base de días (30/360 y actual/365)</w:t>
       </w:r>
     </w:p>
     <w:p>
       <w:r>
-        <w:t>La 'base de dias' define como se cuentan los dias de cada periodo y el denominador anual. Afecta el interes y la mora.</w:t>
+        <w:t>La «base de días» define cómo se cuentan los días de cada período y el denominador anual. Afecta el interés y la mora.</w:t>
       </w:r>
     </w:p>
     <w:tbl>
@@ -2632,7 +2632,7 @@
                 <w:color w:val="FFFFFF"/>
                 <w:sz w:val="19"/>
               </w:rPr>
-              <w:t>Convencion</w:t>
+              <w:t>Convención</w:t>
             </w:r>
           </w:p>
         </w:tc>
@@ -2649,7 +2649,7 @@
                 <w:color w:val="FFFFFF"/>
                 <w:sz w:val="19"/>
               </w:rPr>
-              <w:t>Como cuenta los dias</w:t>
+              <w:t>Cómo cuenta los días</w:t>
             </w:r>
           </w:p>
         </w:tc>
@@ -2683,7 +2683,7 @@
                 <w:color w:val="FFFFFF"/>
                 <w:sz w:val="19"/>
               </w:rPr>
-              <w:t>Uso tipico</w:t>
+              <w:t>Uso típico</w:t>
             </w:r>
           </w:p>
         </w:tc>
@@ -2713,7 +2713,7 @@
               <w:rPr>
                 <w:sz w:val="19"/>
               </w:rPr>
-              <w:t>Cada mes = 30 dias; ano = 360</w:t>
+              <w:t>Cada mes = 30 días; año = 360</w:t>
             </w:r>
           </w:p>
         </w:tc>
@@ -2771,7 +2771,7 @@
               <w:rPr>
                 <w:sz w:val="19"/>
               </w:rPr>
-              <w:t>Dias calendario reales</w:t>
+              <w:t>Días calendario reales</w:t>
             </w:r>
           </w:p>
         </w:tc>
@@ -2799,7 +2799,7 @@
               <w:rPr>
                 <w:sz w:val="19"/>
               </w:rPr>
-              <w:t>Consumo, microcredito, productos a tasa de mercado</w:t>
+              <w:t>Consumo, microcrédito, productos a tasa de mercado</w:t>
             </w:r>
           </w:p>
         </w:tc>
@@ -2832,12 +2832,12 @@
         <w:rPr>
           <w:color w:val="1F3A5F"/>
         </w:rPr>
-        <w:t>8. Valoracion de intereses: IDI al vencimiento vs. IDI diario</w:t>
+        <w:t>8. Valoración de intereses: IDI al vencimiento vs. IDI diario</w:t>
       </w:r>
     </w:p>
     <w:p>
       <w:r>
-        <w:t>Los intereses se acumulan en UVC, pero hay que expresarlos en bolivares. La pregunta es: que IDI se usa para esa conversion. Hay dos modalidades.</w:t>
+        <w:t>Los intereses se acumulan en UVC, pero hay que expresarlos en bolívares. La pregunta es: qué IDI se usa para esa conversión. Hay dos modalidades.</w:t>
       </w:r>
     </w:p>
     <w:p>
@@ -2853,7 +2853,7 @@
     </w:p>
     <w:p>
       <w:r>
-        <w:t>Sencillo: convierte todo el interes del periodo con el IDI del dia de vencimiento.</w:t>
+        <w:t>Sencillo: convierte todo el interés del período con el IDI del día de vencimiento.</w:t>
       </w:r>
     </w:p>
     <w:p>
@@ -2883,7 +2883,7 @@
     </w:p>
     <w:p>
       <w:r>
-        <w:t>Mas preciso: reparte el interes dia a dia y cada porcion se convierte con el IDI de su propio dia. Es el criterio de devengo diario que usan los modelos contables.</w:t>
+        <w:t>Más preciso: reparte el interés día a día y cada porción se convierte con el IDI de su propio día. Es el criterio de devengo diario que usan los modelos contables.</w:t>
       </w:r>
     </w:p>
     <w:p>
@@ -2929,13 +2929,13 @@
                 <w:color w:val="1F3A5F"/>
                 <w:sz w:val="20"/>
               </w:rPr>
-              <w:t xml:space="preserve">Cual usar:  </w:t>
+              <w:t xml:space="preserve">¿Cuál usar?  </w:t>
             </w:r>
             <w:r>
               <w:rPr>
                 <w:sz w:val="20"/>
               </w:rPr>
-              <w:t>el IDI diario es el mas defendible ante una auditoria y el que mejor refleja la inflacion del periodo. El IDI al vencimiento es una simplificacion aceptable para presentaciones administrativas.</w:t>
+              <w:t>el IDI diario es el más defendible ante una auditoría y el que mejor refleja la inflación del período. El IDI al vencimiento es una simplificación aceptable para presentaciones administrativas.</w:t>
             </w:r>
           </w:p>
         </w:tc>
@@ -2954,12 +2954,12 @@
         <w:rPr>
           <w:color w:val="1F3A5F"/>
         </w:rPr>
-        <w:t>9. Desglose de la cuota en bolivares (base, variacion y valorizacion UVC)</w:t>
+        <w:t>9. Desglose de la cuota en bolívares (base, variación y valorización UVC)</w:t>
       </w:r>
     </w:p>
     <w:p>
       <w:r>
-        <w:t>Cada cuota en bolivares tiene dos partes: intereses y amortizacion. A su vez, cada una de esas partes se separa en un 'componente base' (valor al IDI de desembolso) y un 'componente de variacion' (la actualizacion por inflacion entre el desembolso y el vencimiento).</w:t>
+        <w:t>Cada cuota en bolívares tiene dos partes: intereses y amortización. A su vez, cada una de esas partes se separa en un «componente base» (valor al IDI de desembolso) y un «componente de variación» (la actualización por inflación entre el desembolso y el vencimiento).</w:t>
       </w:r>
     </w:p>
     <w:p>
@@ -2999,7 +2999,7 @@
         <w:rPr>
           <w:color w:val="2E5A88"/>
         </w:rPr>
-        <w:t>9.2 Componente base vs. componente de variacion</w:t>
+        <w:t>9.2 Componente base vs. componente de variación</w:t>
       </w:r>
     </w:p>
     <w:p>
@@ -3022,7 +3022,7 @@
     </w:p>
     <w:p>
       <w:r>
-        <w:t>Esto se calcula por separado para la amortizacion y para el interes (amortBaseBs / amortVarBs, interesBaseBs / interesVarBs). Permite reportar la utilidad financiera ordinaria por separado de la utilidad por actualizacion monetaria, y alimenta los asientos contables (cuentas .M.35 vs .M.36).</w:t>
+        <w:t>Esto se calcula por separado para la amortización y para el interés (amortBaseBs / amortVarBs, interesBaseBs / interesVarBs). Permite reportar la utilidad financiera ordinaria por separado de la utilidad por actualización monetaria, y alimenta los asientos contables (cuentas .M.35 vs. .M.36).</w:t>
       </w:r>
     </w:p>
     <w:p>
@@ -3033,12 +3033,12 @@
         <w:rPr>
           <w:color w:val="2E5A88"/>
         </w:rPr>
-        <w:t>9.3 Valorizacion UVC</w:t>
+        <w:t>9.3 Valorización UVC</w:t>
       </w:r>
     </w:p>
     <w:p>
       <w:r>
-        <w:t>La valorizacion UVC es la ganancia en bolivares que produce la inflacion (subida del IDI) entre el desembolso y el vencimiento de cada cuota:</w:t>
+        <w:t>La valorización UVC es la ganancia en bolívares que produce la inflación (subida del IDI) entre el desembolso y el vencimiento de cada cuota:</w:t>
       </w:r>
     </w:p>
     <w:p>
@@ -3082,7 +3082,7 @@
                 <w:color w:val="FFFFFF"/>
                 <w:sz w:val="19"/>
               </w:rPr>
-              <w:t>Situacion del IDI</w:t>
+              <w:t>Situación del IDI</w:t>
             </w:r>
           </w:p>
         </w:tc>
@@ -3099,7 +3099,7 @@
                 <w:color w:val="FFFFFF"/>
                 <w:sz w:val="19"/>
               </w:rPr>
-              <w:t>Resultado de la valorizacion</w:t>
+              <w:t>Resultado de la valorización</w:t>
             </w:r>
           </w:p>
         </w:tc>
@@ -3115,7 +3115,7 @@
               <w:rPr>
                 <w:sz w:val="19"/>
               </w:rPr>
-              <w:t>IDI_vencimiento &gt; IDI_desembolso (inflacion)</w:t>
+              <w:t>IDI_vencimiento &gt; IDI_desembolso (inflación)</w:t>
             </w:r>
           </w:p>
         </w:tc>
@@ -3129,7 +3129,7 @@
               <w:rPr>
                 <w:sz w:val="19"/>
               </w:rPr>
-              <w:t>Valorizacion positiva: el banco recibe mas Bs por la misma UVC.</w:t>
+              <w:t>Valorización positiva: el banco recibe más Bs por la misma UVC.</w:t>
             </w:r>
           </w:p>
         </w:tc>
@@ -3159,7 +3159,7 @@
               <w:rPr>
                 <w:sz w:val="19"/>
               </w:rPr>
-              <w:t>Valorizacion cero: no hubo cambio de valor.</w:t>
+              <w:t>Valorización cero: no hubo cambio de valor.</w:t>
             </w:r>
           </w:p>
         </w:tc>
@@ -3175,7 +3175,7 @@
               <w:rPr>
                 <w:sz w:val="19"/>
               </w:rPr>
-              <w:t>IDI_vencimiento &lt; IDI_desembolso (deflacion del IDI)</w:t>
+              <w:t>IDI_vencimiento &lt; IDI_desembolso (deflación del IDI)</w:t>
             </w:r>
           </w:p>
         </w:tc>
@@ -3189,7 +3189,7 @@
               <w:rPr>
                 <w:sz w:val="19"/>
               </w:rPr>
-              <w:t>Valorizacion negativa: se reversa contablemente.</w:t>
+              <w:t>Valorización negativa: se reversa contablemente.</w:t>
             </w:r>
           </w:p>
         </w:tc>
@@ -3208,12 +3208,12 @@
         <w:rPr>
           <w:color w:val="1F3A5F"/>
         </w:rPr>
-        <w:t>10. Saldo del credito</w:t>
+        <w:t>10. Saldo del crédito</w:t>
       </w:r>
     </w:p>
     <w:p>
       <w:r>
-        <w:t>El saldo se lleva en UVC y se expresa en bolivares cuando se necesita:</w:t>
+        <w:t>El saldo se lleva en UVC y se expresa en bolívares cuando se necesita:</w:t>
       </w:r>
     </w:p>
     <w:p>
@@ -3242,7 +3242,7 @@
         <w:pStyle w:val="ListBullet"/>
       </w:pPr>
       <w:r>
-        <w:t>Si hay un pago valido registrado, el saldo baja por el capital realmente pagado (en UVC), lo que captura pagos parciales y prepagos.</w:t>
+        <w:t>Si hay un pago válido registrado, el saldo baja por el capital realmente pagado (en UVC), lo que captura pagos parciales y prepagos.</w:t>
       </w:r>
     </w:p>
     <w:p>
@@ -3250,7 +3250,7 @@
         <w:pStyle w:val="ListBullet"/>
       </w:pPr>
       <w:r>
-        <w:t>Si todavia no hay pago, el saldo baja por la amortizacion programada, para que el calendario muestre el comportamiento normal del metodo frances aun antes de cobrar.</w:t>
+        <w:t>Si todavía no hay pago, el saldo baja por la amortización programada, para que el calendario muestre el comportamiento normal del método francés aun antes de cobrar.</w:t>
       </w:r>
     </w:p>
     <w:p>
@@ -3261,7 +3261,7 @@
         <w:rPr>
           <w:color w:val="1F3A5F"/>
         </w:rPr>
-        <w:t>11. Mora: cuando, cuanto y sobre que se cobra</w:t>
+        <w:t>11. Mora: cuándo, cuánto y sobre qué se cobra</w:t>
       </w:r>
     </w:p>
     <w:p>
@@ -3272,12 +3272,12 @@
         <w:rPr>
           <w:color w:val="2E5A88"/>
         </w:rPr>
-        <w:t>11.1 Dias de mora</w:t>
+        <w:t>11.1 Días de mora</w:t>
       </w:r>
     </w:p>
     <w:p>
       <w:r>
-        <w:t>La mora empieza el primer dia de atraso despues del vencimiento, descontando los dias de gracia configurados.</w:t>
+        <w:t>La mora empieza el primer día de atraso después del vencimiento, descontando los días de gracia configurados.</w:t>
       </w:r>
     </w:p>
     <w:p>
@@ -3302,7 +3302,7 @@
         <w:rPr>
           <w:color w:val="2E5A88"/>
         </w:rPr>
-        <w:t>11.2 Formula de la mora</w:t>
+        <w:t>11.2 Fórmula de la mora</w:t>
       </w:r>
     </w:p>
     <w:p>
@@ -3331,7 +3331,7 @@
     </w:p>
     <w:p>
       <w:r>
-        <w:t>Conversion a bolivares (igual que el interes, segun la modalidad de valoracion):</w:t>
+        <w:t>Conversión a bolívares (igual que el interés, según la modalidad de valoración):</w:t>
       </w:r>
     </w:p>
     <w:p>
@@ -3358,7 +3358,7 @@
         <w:rPr>
           <w:color w:val="2E5A88"/>
         </w:rPr>
-        <w:t>11.3 Comparacion de bases de mora</w:t>
+        <w:t>11.3 Comparación de bases de mora</w:t>
       </w:r>
     </w:p>
     <w:tbl>
@@ -3404,7 +3404,7 @@
                 <w:color w:val="FFFFFF"/>
                 <w:sz w:val="19"/>
               </w:rPr>
-              <w:t>Sobre que cobra</w:t>
+              <w:t>Sobre qué cobra</w:t>
             </w:r>
           </w:p>
         </w:tc>
@@ -3421,7 +3421,7 @@
                 <w:color w:val="FFFFFF"/>
                 <w:sz w:val="19"/>
               </w:rPr>
-              <w:t>Cuando se usa</w:t>
+              <w:t>Cuándo se usa</w:t>
             </w:r>
           </w:p>
         </w:tc>
@@ -3465,7 +3465,7 @@
               <w:rPr>
                 <w:sz w:val="19"/>
               </w:rPr>
-              <w:t>Opcion por defecto y de mayor aceptacion regulatoria.</w:t>
+              <w:t>Opción por defecto y de mayor aceptación regulatoria.</w:t>
             </w:r>
           </w:p>
         </w:tc>
@@ -3495,7 +3495,7 @@
               <w:rPr>
                 <w:sz w:val="19"/>
               </w:rPr>
-              <w:t>El saldo total del credito</w:t>
+              <w:t>El saldo total del crédito</w:t>
             </w:r>
           </w:p>
         </w:tc>
@@ -3509,7 +3509,7 @@
               <w:rPr>
                 <w:sz w:val="19"/>
               </w:rPr>
-              <w:t>Mas penalizante; solo si el contrato lo especifica.</w:t>
+              <w:t>Más penalizante; solo si el contrato lo especifica.</w:t>
             </w:r>
           </w:p>
         </w:tc>
@@ -3548,7 +3548,7 @@
               <w:rPr>
                 <w:sz w:val="20"/>
               </w:rPr>
-              <w:t>para creditos en UVC la mora maxima es 0,80% anual adicional; para creditos no UVC, 3% anual (Res. BCV 21-01-02, Art. 7). El sistema verifica estos topes automaticamente.</w:t>
+              <w:t>para créditos en UVC la mora máxima es 0,80 % anual adicional; para créditos no UVC, 3 % anual (Res. BCV 21-01-02, Art. 7). El sistema verifica estos topes automáticamente.</w:t>
             </w:r>
           </w:p>
         </w:tc>
@@ -3592,7 +3592,7 @@
                 <w:color w:val="1B5E20"/>
                 <w:sz w:val="20"/>
               </w:rPr>
-              <w:t xml:space="preserve">Ejemplo A - mora leve (10 dias, umbral 30):  </w:t>
+              <w:t xml:space="preserve">Ejemplo A - mora leve (10 días, umbral 30):  </w:t>
             </w:r>
             <w:r>
               <w:rPr>
@@ -3631,7 +3631,7 @@
                 <w:color w:val="8E1B1B"/>
                 <w:sz w:val="20"/>
               </w:rPr>
-              <w:t xml:space="preserve">Ejemplo B - mora avanzada (75 dias, umbral 30):  </w:t>
+              <w:t xml:space="preserve">Ejemplo B - mora avanzada (75 días, umbral 30):  </w:t>
             </w:r>
             <w:r>
               <w:rPr>
@@ -3656,7 +3656,7 @@
         <w:rPr>
           <w:color w:val="1F3A5F"/>
         </w:rPr>
-        <w:t>12. Orden de imputacion de los pagos</w:t>
+        <w:t>12. Orden de imputación de los pagos</w:t>
       </w:r>
     </w:p>
     <w:p>
@@ -3669,7 +3669,7 @@
         <w:pStyle w:val="ListNumber"/>
       </w:pPr>
       <w:r>
-        <w:t>Mora (intereses moratorios pendientes + mora del periodo).</w:t>
+        <w:t>Mora (intereses moratorios pendientes + mora del período).</w:t>
       </w:r>
     </w:p>
     <w:p>
@@ -3677,7 +3677,7 @@
         <w:pStyle w:val="ListNumber"/>
       </w:pPr>
       <w:r>
-        <w:t>Intereses corrientes (vencidos + del periodo).</w:t>
+        <w:t>Intereses corrientes (vencidos + del período).</w:t>
       </w:r>
     </w:p>
     <w:p>
@@ -3685,7 +3685,7 @@
         <w:pStyle w:val="ListNumber"/>
       </w:pPr>
       <w:r>
-        <w:t>Capital de la cuota (amortizacion programada).</w:t>
+        <w:t>Capital de la cuota (amortización programada).</w:t>
       </w:r>
     </w:p>
     <w:p>
@@ -3693,7 +3693,7 @@
         <w:pStyle w:val="ListNumber"/>
       </w:pPr>
       <w:r>
-        <w:t>Excedente -&gt; abono a capital (prepago), solo si applyPrepay esta activo.</w:t>
+        <w:t>Excedente -&gt; abono a capital (prepago), solo si applyPrepay está activo.</w:t>
       </w:r>
     </w:p>
     <w:p>
@@ -3765,12 +3765,12 @@
         <w:rPr>
           <w:color w:val="1F3A5F"/>
         </w:rPr>
-        <w:t>13. Clasificacion de la cartera de creditos</w:t>
+        <w:t>13. Clasificación de la cartera de créditos</w:t>
       </w:r>
     </w:p>
     <w:p>
       <w:r>
-        <w:t>Segun los dias de mora, cada cuota se clasifica en una categoria de riesgo. Los umbrales (mora1, mora2, mora3) son configurables.</w:t>
+        <w:t>Según los días de mora, cada cuota se clasifica en una categoría de riesgo. Los umbrales (mora1, mora2, mora3) son configurables.</w:t>
       </w:r>
     </w:p>
     <w:tbl>
@@ -3799,7 +3799,7 @@
                 <w:color w:val="FFFFFF"/>
                 <w:sz w:val="19"/>
               </w:rPr>
-              <w:t>Clasificacion</w:t>
+              <w:t>Clasificación</w:t>
             </w:r>
           </w:p>
         </w:tc>
@@ -3816,7 +3816,7 @@
                 <w:color w:val="FFFFFF"/>
                 <w:sz w:val="19"/>
               </w:rPr>
-              <w:t>Dias de mora</w:t>
+              <w:t>Días de mora</w:t>
             </w:r>
           </w:p>
         </w:tc>
@@ -3849,7 +3849,7 @@
               <w:rPr>
                 <w:sz w:val="19"/>
               </w:rPr>
-              <w:t>AL DIA</w:t>
+              <w:t>AL DÍA</w:t>
             </w:r>
           </w:p>
         </w:tc>
@@ -3921,7 +3921,7 @@
               <w:rPr>
                 <w:sz w:val="19"/>
               </w:rPr>
-              <w:t>Atraso leve; en gestion de cobro.</w:t>
+              <w:t>Atraso leve; en gestión de cobro.</w:t>
             </w:r>
           </w:p>
         </w:tc>
@@ -4009,7 +4009,7 @@
               <w:rPr>
                 <w:sz w:val="19"/>
               </w:rPr>
-              <w:t>Atraso significativo; provision especifica.</w:t>
+              <w:t>Atraso significativo; provisión específica.</w:t>
             </w:r>
           </w:p>
         </w:tc>
@@ -4039,7 +4039,7 @@
               <w:rPr>
                 <w:sz w:val="19"/>
               </w:rPr>
-              <w:t>mas de mora3 (90)</w:t>
+              <w:t>más de mora3 (90)</w:t>
             </w:r>
           </w:p>
         </w:tc>
@@ -4099,7 +4099,7 @@
     </w:p>
     <w:p>
       <w:r>
-        <w:t>El punto de quiebre contable es el umbral mora2. Mientras el atraso no lo supere, la cuota esta 'en orden' contablemente y los rendimientos van a cuentas de activo (grupo 143). Cuando lo supera, los rendimientos y la mora se trasladan a cuentas de orden (grupo 819) y dejan de reconocerse como ingreso realizado, por prudencia.</w:t>
+        <w:t>El punto de quiebre contable es el umbral mora2. Mientras el atraso no lo supere, la cuota está «en orden» contablemente y los rendimientos van a cuentas de activo (grupo 143). Cuando lo supera, los rendimientos y la mora se trasladan a cuentas de orden (grupo 819) y dejan de reconocerse como ingreso realizado, por prudencia.</w:t>
       </w:r>
     </w:p>
     <w:p>
@@ -4127,7 +4127,7 @@
     </w:p>
     <w:p>
       <w:r>
-        <w:t>Los indicadores 'Moratorio 143' y 'Moratorio 819' reflejan UNICAMENTE el interes moratorio (la mora), no el rendimiento convencional, que se reporta aparte:</w:t>
+        <w:t>Los indicadores «Moratorio 143» y «Moratorio 819» reflejan ÚNICAMENTE el interés moratorio (la mora), no el rendimiento convencional, que se reporta aparte:</w:t>
       </w:r>
     </w:p>
     <w:p>
@@ -4172,7 +4172,7 @@
                 <w:color w:val="FFFFFF"/>
                 <w:sz w:val="19"/>
               </w:rPr>
-              <w:t>Condicion</w:t>
+              <w:t>Condición</w:t>
             </w:r>
           </w:p>
         </w:tc>
@@ -4222,7 +4222,7 @@
               <w:rPr>
                 <w:sz w:val="19"/>
               </w:rPr>
-              <w:t>Al dia / mora leve (&lt;= mora2)</w:t>
+              <w:t>Al día / mora leve (&lt;= mora2)</w:t>
             </w:r>
           </w:p>
         </w:tc>
@@ -4313,12 +4313,12 @@
         <w:rPr>
           <w:color w:val="1F3A5F"/>
         </w:rPr>
-        <w:t>15. Congelamiento del credito vencido</w:t>
+        <w:t>15. Congelamiento del crédito vencido</w:t>
       </w:r>
     </w:p>
     <w:p>
       <w:r>
-        <w:t>Conforme a la minuta SUDEBAN/BCV/ABV del 17/12/2019, cuando una cuota pasa a 'en orden' (supera mora2) el credito se 'congela':</w:t>
+        <w:t>Conforme a la minuta SUDEBAN/BCV/ABV del 17/12/2019, cuando una cuota pasa a «en orden» (supera mora2) el crédito se «congela»:</w:t>
       </w:r>
     </w:p>
     <w:p>
@@ -4326,7 +4326,7 @@
         <w:pStyle w:val="ListBullet"/>
       </w:pPr>
       <w:r>
-        <w:t>Deja de someterse a la actualizacion diaria por IDI en las cuentas reales (Cartera y Patrimonio).</w:t>
+        <w:t>Deja de someterse a la actualización diaria por IDI en las cuentas reales (Cartera y Patrimonio).</w:t>
       </w:r>
     </w:p>
     <w:p>
@@ -4334,7 +4334,7 @@
         <w:pStyle w:val="ListBullet"/>
       </w:pPr>
       <w:r>
-        <w:t>La revalorizacion de capital y de rendimientos se devenga en cuentas de orden hasta que el cliente pague.</w:t>
+        <w:t>La revalorización de capital y de rendimientos se devenga en cuentas de orden hasta que el cliente pague.</w:t>
       </w:r>
     </w:p>
     <w:p>
@@ -4342,12 +4342,12 @@
         <w:pStyle w:val="ListBullet"/>
       </w:pPr>
       <w:r>
-        <w:t>Al cobrarse, se reconoce en resultados/patrimonio; el incremento del capital revaluado se registra en la cuenta patrimonial 358.00 'Variacion de Creditos Comerciales'.</w:t>
+        <w:t>Al cobrarse, se reconoce en resultados/patrimonio; el incremento del capital revaluado se registra en la cuenta patrimonial 358.00 «Variación de Créditos Comerciales».</w:t>
       </w:r>
     </w:p>
     <w:p>
       <w:r>
-        <w:t>En el calculo, la valorizacion UVC se enruta segun la clasificacion:</w:t>
+        <w:t>En el cálculo, la valorización UVC se enruta según la clasificación:</w:t>
       </w:r>
     </w:p>
     <w:p>
@@ -4374,12 +4374,12 @@
         <w:rPr>
           <w:color w:val="1F3A5F"/>
         </w:rPr>
-        <w:t>16. Cancelacion anticipada y prepagos</w:t>
+        <w:t>16. Cancelación anticipada y prepagos</w:t>
       </w:r>
     </w:p>
     <w:p>
       <w:r>
-        <w:t>Cuando el cliente paga mas que la cuota exigible, el excedente se abona a capital (si applyPrepay esta activo). El sistema ofrece dos politicas de reconduccion del calendario:</w:t>
+        <w:t>Cuando el cliente paga más que la cuota exigible, el excedente se abona a capital (si applyPrepay está activo). El sistema ofrece dos políticas de reconducción del calendario:</w:t>
       </w:r>
     </w:p>
     <w:tbl>
@@ -4408,7 +4408,7 @@
                 <w:color w:val="FFFFFF"/>
                 <w:sz w:val="19"/>
               </w:rPr>
-              <w:t>Politica</w:t>
+              <w:t>Política</w:t>
             </w:r>
           </w:p>
         </w:tc>
@@ -4425,7 +4425,7 @@
                 <w:color w:val="FFFFFF"/>
                 <w:sz w:val="19"/>
               </w:rPr>
-              <w:t>Que mantiene fijo</w:t>
+              <w:t>Qué mantiene fijo</w:t>
             </w:r>
           </w:p>
         </w:tc>
@@ -4549,12 +4549,12 @@
         <w:rPr>
           <w:color w:val="2E5A88"/>
         </w:rPr>
-        <w:t>16.1 Recalculo tras el prepago</w:t>
+        <w:t>16.1 Recálculo tras el prepago</w:t>
       </w:r>
     </w:p>
     <w:p>
       <w:r>
-        <w:t>Reducir plazo: se mantiene la cuota y se recalcula cuantas cuotas faltan.</w:t>
+        <w:t>Reducir plazo: se mantiene la cuota y se recalcula cuántas cuotas faltan.</w:t>
       </w:r>
     </w:p>
     <w:p>
@@ -4600,12 +4600,12 @@
         <w:rPr>
           <w:color w:val="2E5A88"/>
         </w:rPr>
-        <w:t>16.2 Piso de IDI en cancelacion anticipada</w:t>
+        <w:t>16.2 Piso de IDI en cancelación anticipada</w:t>
       </w:r>
     </w:p>
     <w:p>
       <w:r>
-        <w:t>La Resolucion BCV 21-01-02 (Art. 5 lit. b/c y Art. 6) protege al acreedor: si el IDI del dia de pago es menor que el IDI de otorgamiento, para calcular el monto a pagar se usa el de otorgamiento. Asi el banco recupera al menos el valor nominal en UVC.</w:t>
+        <w:t>La Resolución BCV 21-01-02 (Art. 5 lit. b/c y Art. 6) protege al acreedor: si el IDI del día de pago es menor que el IDI de otorgamiento, para calcular el monto a pagar se usa el de otorgamiento. Así el banco recupera al menos el valor nominal en UVC.</w:t>
       </w:r>
     </w:p>
     <w:p>
@@ -4644,13 +4644,13 @@
                 <w:color w:val="1F3A5F"/>
                 <w:sz w:val="20"/>
               </w:rPr>
-              <w:t xml:space="preserve">Cuando actua:  </w:t>
+              <w:t xml:space="preserve">¿Cuándo actúa?  </w:t>
             </w:r>
             <w:r>
               <w:rPr>
                 <w:sz w:val="20"/>
               </w:rPr>
-              <w:t>solo cuando el IDI cae por debajo del de otorgamiento (escenario de deflacion del indice). En el escenario normal de IDI creciente, no cambia nada. La fila marca idiFloorApplied = true cuando el piso se activo.</w:t>
+              <w:t>solo cuando el IDI cae por debajo del de otorgamiento (escenario de deflación del índice). En el escenario normal de IDI creciente, no cambia nada. La fila marca idiFloorApplied = true cuando el piso se activó.</w:t>
             </w:r>
           </w:p>
         </w:tc>
@@ -4690,7 +4690,7 @@
     </w:p>
     <w:p>
       <w:r>
-        <w:t>Al entregar el credito. El capital se reconoce en la cartera (131.35); el banco entrega el neto (capital menos comision); la comision flat es un ingreso.</w:t>
+        <w:t>Al entregar el crédito. El capital se reconoce en la cartera (131.35); el banco entrega el neto (capital menos comisión); la comisión flat es un ingreso.</w:t>
       </w:r>
     </w:p>
     <w:p>
@@ -4698,7 +4698,7 @@
         <w:rPr>
           <w:b/>
         </w:rPr>
-        <w:t>Desembolso del credito:</w:t>
+        <w:t>Desembolso del crédito:</w:t>
       </w:r>
     </w:p>
     <w:tbl>
@@ -4777,7 +4777,7 @@
               <w:rPr>
                 <w:sz w:val="19"/>
               </w:rPr>
-              <w:t>131.35 Creditos comerciales (capital base)</w:t>
+              <w:t>131.35 Créditos comerciales (capital base)</w:t>
             </w:r>
           </w:p>
         </w:tc>
@@ -4849,7 +4849,7 @@
               <w:rPr>
                 <w:sz w:val="19"/>
               </w:rPr>
-              <w:t>Neto = Capital - Comision</w:t>
+              <w:t>Neto = Capital - Comisión</w:t>
             </w:r>
           </w:p>
         </w:tc>
@@ -4865,7 +4865,7 @@
               <w:rPr>
                 <w:sz w:val="19"/>
               </w:rPr>
-              <w:t>532.00 Comision flat por desembolso (si &gt; 0)</w:t>
+              <w:t>532.00 Comisión flat por desembolso (si &gt; 0)</w:t>
             </w:r>
           </w:p>
         </w:tc>
@@ -4893,7 +4893,7 @@
               <w:rPr>
                 <w:sz w:val="19"/>
               </w:rPr>
-              <w:t>Comision</w:t>
+              <w:t>Comisión</w:t>
             </w:r>
           </w:p>
         </w:tc>
@@ -4956,12 +4956,12 @@
         <w:rPr>
           <w:color w:val="2E5A88"/>
         </w:rPr>
-        <w:t>17.2 Devengo de intereses (cada periodo)</w:t>
+        <w:t>17.2 Devengo de intereses (cada período)</w:t>
       </w:r>
     </w:p>
     <w:p>
       <w:r>
-        <w:t>El rendimiento se separa en componente base (513.01.M.35) y componente por variacion / actualizacion UVC (513.01.M.36). Solo se generan las lineas con monto significativo.</w:t>
+        <w:t>El rendimiento se separa en componente base (513.01.M.35) y componente por variación / actualización UVC (513.01.M.36). Solo se generan las líneas con monto significativo.</w:t>
       </w:r>
     </w:p>
     <w:p>
@@ -4969,7 +4969,7 @@
         <w:rPr>
           <w:b/>
         </w:rPr>
-        <w:t>Devengo interes cuota k:</w:t>
+        <w:t>Devengo interés cuota k:</w:t>
       </w:r>
     </w:p>
     <w:tbl>
@@ -5062,7 +5062,7 @@
               <w:rPr>
                 <w:sz w:val="19"/>
               </w:rPr>
-              <w:t>Interes_Bs</w:t>
+              <w:t>Interés_Bs</w:t>
             </w:r>
           </w:p>
         </w:tc>
@@ -5092,7 +5092,7 @@
               <w:rPr>
                 <w:sz w:val="19"/>
               </w:rPr>
-              <w:t>513.01.M.35 Rendimientos por creditos comerciales (base)</w:t>
+              <w:t>513.01.M.35 Rendimientos por créditos comerciales (base)</w:t>
             </w:r>
           </w:p>
         </w:tc>
@@ -5120,7 +5120,7 @@
               <w:rPr>
                 <w:sz w:val="19"/>
               </w:rPr>
-              <w:t>Interes base</w:t>
+              <w:t>Interés base</w:t>
             </w:r>
           </w:p>
         </w:tc>
@@ -5136,7 +5136,7 @@
               <w:rPr>
                 <w:sz w:val="19"/>
               </w:rPr>
-              <w:t>513.01.M.36 Rendimientos por variacion (actualizacion)</w:t>
+              <w:t>513.01.M.36 Rendimientos por variación (actualización)</w:t>
             </w:r>
           </w:p>
         </w:tc>
@@ -5164,7 +5164,7 @@
               <w:rPr>
                 <w:sz w:val="19"/>
               </w:rPr>
-              <w:t>Interes variacion</w:t>
+              <w:t>Interés variación</w:t>
             </w:r>
           </w:p>
         </w:tc>
@@ -5183,12 +5183,12 @@
         <w:rPr>
           <w:color w:val="2E5A88"/>
         </w:rPr>
-        <w:t>17.3 Variacion de capital (actualizacion por IDI)</w:t>
+        <w:t>17.3 Variación de capital (actualización por IDI)</w:t>
       </w:r>
     </w:p>
     <w:p>
       <w:r>
-        <w:t>Registra el cambio de valor del capital amortizado por efecto del IDI. Si la variacion es positiva (IDI sube) se carga 131.36 contra 358.01; si es negativa, se invierte el asiento.</w:t>
+        <w:t>Registra el cambio de valor del capital amortizado por efecto del IDI. Si la variación es positiva (IDI sube) se carga 131.36 contra 358.01; si es negativa, se invierte el asiento.</w:t>
       </w:r>
     </w:p>
     <w:p>
@@ -5196,7 +5196,7 @@
         <w:rPr>
           <w:b/>
         </w:rPr>
-        <w:t>Variacion de capital - incremento (IDI sube):</w:t>
+        <w:t>Variación de capital - incremento (IDI sube):</w:t>
       </w:r>
     </w:p>
     <w:tbl>
@@ -5275,7 +5275,7 @@
               <w:rPr>
                 <w:sz w:val="19"/>
               </w:rPr>
-              <w:t>131.36 Variacion de creditos comerciales</w:t>
+              <w:t>131.36 Variación de créditos comerciales</w:t>
             </w:r>
           </w:p>
         </w:tc>
@@ -5319,7 +5319,7 @@
               <w:rPr>
                 <w:sz w:val="19"/>
               </w:rPr>
-              <w:t>358.01 Variacion de creditos comerciales (patrimonio)</w:t>
+              <w:t>358.01 Variación de créditos comerciales (patrimonio)</w:t>
             </w:r>
           </w:p>
         </w:tc>
@@ -5363,7 +5363,7 @@
         <w:rPr>
           <w:b/>
         </w:rPr>
-        <w:t>Variacion de capital - disminucion (IDI baja):</w:t>
+        <w:t>Variación de capital - disminución (IDI baja):</w:t>
       </w:r>
     </w:p>
     <w:tbl>
@@ -5442,7 +5442,7 @@
               <w:rPr>
                 <w:sz w:val="19"/>
               </w:rPr>
-              <w:t>358.01 Variacion de creditos comerciales (patrimonio)</w:t>
+              <w:t>358.01 Variación de créditos comerciales (patrimonio)</w:t>
             </w:r>
           </w:p>
         </w:tc>
@@ -5486,7 +5486,7 @@
               <w:rPr>
                 <w:sz w:val="19"/>
               </w:rPr>
-              <w:t>131.36 Variacion de creditos comerciales</w:t>
+              <w:t>131.36 Variación de créditos comerciales</w:t>
             </w:r>
           </w:p>
         </w:tc>
@@ -5847,7 +5847,7 @@
               <w:rPr>
                 <w:sz w:val="19"/>
               </w:rPr>
-              <w:t>138.00 Mora por cobrar (si pago mora)</w:t>
+              <w:t>138.00 Mora por cobrar (si pagó mora)</w:t>
             </w:r>
           </w:p>
         </w:tc>
@@ -5891,7 +5891,7 @@
               <w:rPr>
                 <w:sz w:val="19"/>
               </w:rPr>
-              <w:t>138.00 Rendimientos por cobrar (si pago interes)</w:t>
+              <w:t>138.00 Rendimientos por cobrar (si pagó interés)</w:t>
             </w:r>
           </w:p>
         </w:tc>
@@ -5919,7 +5919,7 @@
               <w:rPr>
                 <w:sz w:val="19"/>
               </w:rPr>
-              <w:t>Interes pagado</w:t>
+              <w:t>Interés pagado</w:t>
             </w:r>
           </w:p>
         </w:tc>
@@ -5935,7 +5935,7 @@
               <w:rPr>
                 <w:sz w:val="19"/>
               </w:rPr>
-              <w:t>131.35 Creditos comerciales (capital + prepago)</w:t>
+              <w:t>131.35 Créditos comerciales (capital + prepago)</w:t>
             </w:r>
           </w:p>
         </w:tc>
@@ -5987,7 +5987,7 @@
     </w:p>
     <w:p>
       <w:r>
-        <w:t>Codigos del Manual de Contabilidad para Instituciones Bancarias (modificacion del 28/10/2019). Las cuentas son configurables por credito.</w:t>
+        <w:t>Códigos del Manual de Contabilidad para Instituciones Bancarias (modificación del 28/10/2019). Las cuentas son configurables por crédito.</w:t>
       </w:r>
     </w:p>
     <w:tbl>
@@ -6016,7 +6016,7 @@
                 <w:color w:val="FFFFFF"/>
                 <w:sz w:val="18"/>
               </w:rPr>
-              <w:t>Codigo</w:t>
+              <w:t>Código</w:t>
             </w:r>
           </w:p>
         </w:tc>
@@ -6124,7 +6124,7 @@
               <w:rPr>
                 <w:sz w:val="18"/>
               </w:rPr>
-              <w:t>Creditos comerciales vigentes objeto de las medidas del BCV</w:t>
+              <w:t>Créditos comerciales vigentes objeto de las medidas del BCV</w:t>
             </w:r>
           </w:p>
         </w:tc>
@@ -6168,7 +6168,7 @@
               <w:rPr>
                 <w:sz w:val="18"/>
               </w:rPr>
-              <w:t>Variacion de creditos comerciales vigentes (.M.01 incr / .M.02 dism)</w:t>
+              <w:t>Variación de créditos comerciales vigentes (.M.01 incr / .M.02 dism)</w:t>
             </w:r>
           </w:p>
         </w:tc>
@@ -6182,7 +6182,7 @@
               <w:rPr>
                 <w:sz w:val="18"/>
               </w:rPr>
-              <w:t>Actualizacion del capital por IDI</w:t>
+              <w:t>Actualización del capital por IDI</w:t>
             </w:r>
           </w:p>
         </w:tc>
@@ -6212,7 +6212,7 @@
               <w:rPr>
                 <w:sz w:val="18"/>
               </w:rPr>
-              <w:t>Variacion de creditos comerciales (patrimonio)</w:t>
+              <w:t>Variación de créditos comerciales (patrimonio)</w:t>
             </w:r>
           </w:p>
         </w:tc>
@@ -6226,7 +6226,7 @@
               <w:rPr>
                 <w:sz w:val="18"/>
               </w:rPr>
-              <w:t>Contrapartida patrimonial de la variacion</w:t>
+              <w:t>Contrapartida patrimonial de la variación</w:t>
             </w:r>
           </w:p>
         </w:tc>
@@ -6256,7 +6256,7 @@
               <w:rPr>
                 <w:sz w:val="18"/>
               </w:rPr>
-              <w:t>Rendimientos por cobrar por creditos comerciales</w:t>
+              <w:t>Rendimientos por cobrar por créditos comerciales</w:t>
             </w:r>
           </w:p>
         </w:tc>
@@ -6300,7 +6300,7 @@
               <w:rPr>
                 <w:sz w:val="18"/>
               </w:rPr>
-              <w:t>Rendimientos por creditos comerciales vigentes</w:t>
+              <w:t>Rendimientos por créditos comerciales vigentes</w:t>
             </w:r>
           </w:p>
         </w:tc>
@@ -6314,7 +6314,7 @@
               <w:rPr>
                 <w:sz w:val="18"/>
               </w:rPr>
-              <w:t>Ingreso por interes (componente base)</w:t>
+              <w:t>Ingreso por interés (componente base)</w:t>
             </w:r>
           </w:p>
         </w:tc>
@@ -6344,7 +6344,7 @@
               <w:rPr>
                 <w:sz w:val="18"/>
               </w:rPr>
-              <w:t>Rendimientos por variacion de creditos comerciales</w:t>
+              <w:t>Rendimientos por variación de créditos comerciales</w:t>
             </w:r>
           </w:p>
         </w:tc>
@@ -6358,7 +6358,7 @@
               <w:rPr>
                 <w:sz w:val="18"/>
               </w:rPr>
-              <w:t>Ingreso por actualizacion UVC</w:t>
+              <w:t>Ingreso por actualización UVC</w:t>
             </w:r>
           </w:p>
         </w:tc>
@@ -6388,7 +6388,7 @@
               <w:rPr>
                 <w:sz w:val="18"/>
               </w:rPr>
-              <w:t>Comisiones flat por desembolso (max 0,50%)</w:t>
+              <w:t>Comisiones flat por desembolso (máx. 0,50 %)</w:t>
             </w:r>
           </w:p>
         </w:tc>
@@ -6402,7 +6402,7 @@
               <w:rPr>
                 <w:sz w:val="18"/>
               </w:rPr>
-              <w:t>Ingreso por comision flat</w:t>
+              <w:t>Ingreso por comisión flat</w:t>
             </w:r>
           </w:p>
         </w:tc>
@@ -6465,12 +6465,12 @@
         <w:rPr>
           <w:color w:val="1F3A5F"/>
         </w:rPr>
-        <w:t>19. Ajuste a dias habiles y feriados</w:t>
+        <w:t>19. Ajuste a días hábiles y feriados</w:t>
       </w:r>
     </w:p>
     <w:p>
       <w:r>
-        <w:t>Si adjustToBusinessDay esta activo y un vencimiento cae en fin de semana o feriado, se mueve al siguiente dia habil (convencion 'following'). Esto afecta:</w:t>
+        <w:t>Si adjustToBusinessDay está activo y un vencimiento cae en fin de semana o feriado, se mueve al siguiente día hábil (convención «following»). Esto afecta:</w:t>
       </w:r>
     </w:p>
     <w:p>
@@ -6478,7 +6478,7 @@
         <w:pStyle w:val="ListBullet"/>
       </w:pPr>
       <w:r>
-        <w:t>Los dias del periodo (en 30/360 puede dar mas de 30 dias si hay ajuste).</w:t>
+        <w:t>Los días del período (en 30/360 puede dar más de 30 días si hay ajuste).</w:t>
       </w:r>
     </w:p>
     <w:p>
@@ -6486,12 +6486,12 @@
         <w:pStyle w:val="ListBullet"/>
       </w:pPr>
       <w:r>
-        <w:t>El IDI aplicado (se usa el del dia habil ajustado).</w:t>
+        <w:t>El IDI aplicado (se usa el del día hábil ajustado).</w:t>
       </w:r>
     </w:p>
     <w:p>
       <w:r>
-        <w:t>Los feriados se cargan en una lista configurable (formato YYYY-MM-DD). Se recomienda mantenerla al dia con el calendario de dias no habiles bancarios del BCV/SUDEBAN.</w:t>
+        <w:t>Los feriados se cargan en una lista configurable (formato AAAA-MM-DD). Se recomienda mantenerla al día con el calendario de días no hábiles bancarios del BCV/SUDEBAN.</w:t>
       </w:r>
     </w:p>
     <w:p>
@@ -6502,12 +6502,12 @@
         <w:rPr>
           <w:color w:val="1F3A5F"/>
         </w:rPr>
-        <w:t>20. Comision flat y cumplimiento regulatorio</w:t>
+        <w:t>20. Comisión flat y cumplimiento regulatorio</w:t>
       </w:r>
     </w:p>
     <w:p>
       <w:r>
-        <w:t>La comision flat de desembolso no puede exceder 0,50% del monto del credito. El sistema evalua el cumplimiento (funcion evaluateCompliance) y clasifica cada verificacion por nivel.</w:t>
+        <w:t>La comisión flat de desembolso no puede exceder 0,50 % del monto del crédito. El sistema evalúa el cumplimiento (función evaluateCompliance) y clasifica cada verificación por nivel.</w:t>
       </w:r>
     </w:p>
     <w:tbl>
@@ -6536,7 +6536,7 @@
                 <w:color w:val="FFFFFF"/>
                 <w:sz w:val="19"/>
               </w:rPr>
-              <w:t>Verificacion</w:t>
+              <w:t>Verificación</w:t>
             </w:r>
           </w:p>
         </w:tc>
@@ -6553,7 +6553,7 @@
                 <w:color w:val="FFFFFF"/>
                 <w:sz w:val="19"/>
               </w:rPr>
-              <w:t>Limite</w:t>
+              <w:t>Límite</w:t>
             </w:r>
           </w:p>
         </w:tc>
@@ -6586,7 +6586,7 @@
               <w:rPr>
                 <w:sz w:val="19"/>
               </w:rPr>
-              <w:t>Tasa de interes (UVC)</w:t>
+              <w:t>Tasa de interés (UVC)</w:t>
             </w:r>
           </w:p>
         </w:tc>
@@ -6600,7 +6600,7 @@
               <w:rPr>
                 <w:sz w:val="19"/>
               </w:rPr>
-              <w:t>4% a 10% (o 2% Cartera Productiva)</w:t>
+              <w:t>4 % a 10 % (o 2 % Cartera Productiva)</w:t>
             </w:r>
           </w:p>
         </w:tc>
@@ -6644,7 +6644,7 @@
               <w:rPr>
                 <w:sz w:val="19"/>
               </w:rPr>
-              <w:t>&lt;= 0,80% anual adicional</w:t>
+              <w:t>&lt;= 0,80 % anual adicional</w:t>
             </w:r>
           </w:p>
         </w:tc>
@@ -6688,7 +6688,7 @@
               <w:rPr>
                 <w:sz w:val="19"/>
               </w:rPr>
-              <w:t>&lt;= 3% anual</w:t>
+              <w:t>&lt;= 3 % anual</w:t>
             </w:r>
           </w:p>
         </w:tc>
@@ -6718,7 +6718,7 @@
               <w:rPr>
                 <w:sz w:val="19"/>
               </w:rPr>
-              <w:t>Comision flat</w:t>
+              <w:t>Comisión flat</w:t>
             </w:r>
           </w:p>
         </w:tc>
@@ -6732,7 +6732,7 @@
               <w:rPr>
                 <w:sz w:val="19"/>
               </w:rPr>
-              <w:t>&lt;= 0,50% del monto</w:t>
+              <w:t>&lt;= 0,50 % del monto</w:t>
             </w:r>
           </w:p>
         </w:tc>
@@ -6823,13 +6823,13 @@
                 <w:color w:val="9A5200"/>
                 <w:sz w:val="20"/>
               </w:rPr>
-              <w:t xml:space="preserve">Modo referencia / historico (allowHistoricalRates):  </w:t>
+              <w:t xml:space="preserve">Modo referencia / histórico (allowHistoricalRates):  </w:t>
             </w:r>
             <w:r>
               <w:rPr>
                 <w:sz w:val="20"/>
               </w:rPr>
-              <w:t>cuando esta activo, los excesos de tasa de interes y de mora se reportan como ALERTA en vez de bloquear. Sirve para reproducir tablas previas a la Resolucion 21-01-02 (por ejemplo, la tabla de referencia con 16% de interes y 3% de mora). Al desactivarlo se exigen estrictamente los topes vigentes.</w:t>
+              <w:t>cuando está activo, los excesos de tasa de interés y de mora se reportan como ALERTA en vez de bloquear. Sirve para reproducir tablas previas a la Resolución 21-01-02 (por ejemplo, la tabla de referencia con 16 % de interés y 3 % de mora). Al desactivarlo se exigen estrictamente los topes vigentes.</w:t>
             </w:r>
           </w:p>
         </w:tc>
@@ -6853,7 +6853,7 @@
     </w:p>
     <w:p>
       <w:r>
-        <w:t>La TIR mide el rendimiento efectivo real del credito para la institucion. Se calcula con los flujos de caja: el neto recibido al inicio (negativo para el banco como salida de efectivo) y los pagos del cliente como entradas. Se resuelve por biseccion buscando la tasa que hace el Valor Presente Neto igual a cero, y luego se anualiza:</w:t>
+        <w:t>La TIR mide el rendimiento efectivo real del crédito para la institución. Se calcula con los flujos de caja: el neto recibido al inicio (negativo para el banco como salida de efectivo) y los pagos del cliente como entradas. Se resuelve por bisección buscando la tasa que hace el Valor Presente Neto igual a cero, y luego se anualiza:</w:t>
       </w:r>
     </w:p>
     <w:p>
@@ -6874,7 +6874,7 @@
     </w:p>
     <w:p>
       <w:r>
-        <w:t>Si no hay al menos un flujo positivo y uno negativo, la TIR no esta definida (devuelve nulo).</w:t>
+        <w:t>Si no hay al menos un flujo positivo y uno negativo, la TIR no está definida (devuelve nulo).</w:t>
       </w:r>
     </w:p>
     <w:p>
@@ -6885,7 +6885,7 @@
         <w:rPr>
           <w:color w:val="1F3A5F"/>
         </w:rPr>
-        <w:t>22. Modo libre vs. modo simulacion</w:t>
+        <w:t>22. Modo libre vs. modo simulación</w:t>
       </w:r>
     </w:p>
     <w:tbl>
@@ -6930,7 +6930,7 @@
                 <w:color w:val="FFFFFF"/>
                 <w:sz w:val="19"/>
               </w:rPr>
-              <w:t>Como trata los pagos</w:t>
+              <w:t>Cómo trata los pagos</w:t>
             </w:r>
           </w:p>
         </w:tc>
@@ -6976,7 +6976,7 @@
               <w:rPr>
                 <w:sz w:val="19"/>
               </w:rPr>
-              <w:t>simulacion</w:t>
+              <w:t>simulación</w:t>
             </w:r>
           </w:p>
         </w:tc>
@@ -6990,7 +6990,7 @@
               <w:rPr>
                 <w:sz w:val="19"/>
               </w:rPr>
-              <w:t>Avanza un 'hoy' simulado (asOf = desembolso + simulationDays). Los pagos con fecha posterior a ese 'hoy' aun no se reconocen.</w:t>
+              <w:t>Avanza un «hoy» simulado (asOf = desembolso + simulationDays). Los pagos con fecha posterior a ese «hoy» aún no se reconocen.</w:t>
             </w:r>
           </w:p>
         </w:tc>
@@ -7003,7 +7003,7 @@
     </w:p>
     <w:p>
       <w:r>
-        <w:t>El 'hoy' simulado (asOfDate) tambien define hasta donde se genera el desglose diario cuando no hay pago registrado.</w:t>
+        <w:t>El «hoy» simulado (asOfDate) también define hasta dónde se genera el desglose diario cuando no hay pago registrado.</w:t>
       </w:r>
     </w:p>
     <w:p>
@@ -7014,12 +7014,12 @@
         <w:rPr>
           <w:color w:val="1F3A5F"/>
         </w:rPr>
-        <w:t>23. Catalogo de situaciones y escenarios</w:t>
+        <w:t>23. Catálogo de situaciones y escenarios</w:t>
       </w:r>
     </w:p>
     <w:p>
       <w:r>
-        <w:t>Resumen de como responde el modelo ante distintas situaciones:</w:t>
+        <w:t>Resumen de cómo responde el modelo ante distintas situaciones:</w:t>
       </w:r>
     </w:p>
     <w:tbl>
@@ -7047,7 +7047,7 @@
                 <w:color w:val="FFFFFF"/>
                 <w:sz w:val="18"/>
               </w:rPr>
-              <w:t>Situacion</w:t>
+              <w:t>Situación</w:t>
             </w:r>
           </w:p>
         </w:tc>
@@ -7094,7 +7094,7 @@
               <w:rPr>
                 <w:sz w:val="18"/>
               </w:rPr>
-              <w:t>No hay mora. Interes + amortizacion del periodo; saldo baja segun lo pagado.</w:t>
+              <w:t>No hay mora. Interés + amortización del período; el saldo baja según lo pagado.</w:t>
             </w:r>
           </w:p>
         </w:tc>
@@ -7154,7 +7154,7 @@
               <w:rPr>
                 <w:sz w:val="18"/>
               </w:rPr>
-              <w:t>Se imputa por orden (mora, interes, capital). El saldo solo baja por el capital efectivamente pagado; el resto queda pendiente.</w:t>
+              <w:t>Se imputa por orden (mora, interés, capital). El saldo solo baja por el capital efectivamente pagado; el resto queda pendiente.</w:t>
             </w:r>
           </w:p>
         </w:tc>
@@ -7184,7 +7184,7 @@
               <w:rPr>
                 <w:sz w:val="18"/>
               </w:rPr>
-              <w:t>No genera mora (dias_mora = 0).</w:t>
+              <w:t>No genera mora (días_mora = 0).</w:t>
             </w:r>
           </w:p>
         </w:tc>
@@ -7200,7 +7200,7 @@
               <w:rPr>
                 <w:sz w:val="18"/>
               </w:rPr>
-              <w:t>Atraso 1 a mora2 dias</w:t>
+              <w:t>Atraso 1 a mora2 días</w:t>
             </w:r>
           </w:p>
         </w:tc>
@@ -7214,7 +7214,7 @@
               <w:rPr>
                 <w:sz w:val="18"/>
               </w:rPr>
-              <w:t>Genera mora; clasificacion MORA 1 / VENCIDO; rendimientos en cartera activa (143).</w:t>
+              <w:t>Genera mora; clasificación MORA 1 / VENCIDO; rendimientos en cartera activa (143).</w:t>
             </w:r>
           </w:p>
         </w:tc>
@@ -7244,7 +7244,7 @@
               <w:rPr>
                 <w:sz w:val="18"/>
               </w:rPr>
-              <w:t>Credito 'en orden': rendimientos y mora a cuentas de orden (819); capital congelado; valorizacion a cuentas de orden.</w:t>
+              <w:t>Crédito «en orden»: rendimientos y mora a cuentas de orden (819); capital congelado; valorización a cuentas de orden.</w:t>
             </w:r>
           </w:p>
         </w:tc>
@@ -7274,7 +7274,7 @@
               <w:rPr>
                 <w:sz w:val="18"/>
               </w:rPr>
-              <w:t>Clasificacion CASTIGO (incobrable).</w:t>
+              <w:t>Clasificación CASTIGO (incobrable).</w:t>
             </w:r>
           </w:p>
         </w:tc>
@@ -7350,7 +7350,7 @@
               <w:rPr>
                 <w:sz w:val="18"/>
               </w:rPr>
-              <w:t>IDI sube (inflacion normal)</w:t>
+              <w:t>IDI sube (inflación normal)</w:t>
             </w:r>
           </w:p>
         </w:tc>
@@ -7364,7 +7364,7 @@
               <w:rPr>
                 <w:sz w:val="18"/>
               </w:rPr>
-              <w:t>Valorizacion positiva; mas bolivares por la misma UVC; el piso de IDI no actua.</w:t>
+              <w:t>Valorización positiva; más bolívares por la misma UVC; el piso de IDI no actúa.</w:t>
             </w:r>
           </w:p>
         </w:tc>
@@ -7394,7 +7394,7 @@
               <w:rPr>
                 <w:sz w:val="18"/>
               </w:rPr>
-              <w:t>Valorizacion negativa (se reversa); el piso de IDI fija el IDI de otorgamiento en cancelaciones.</w:t>
+              <w:t>Valorización negativa (se reversa); el piso de IDI fija el IDI de otorgamiento en cancelaciones.</w:t>
             </w:r>
           </w:p>
         </w:tc>
@@ -7440,7 +7440,7 @@
               <w:rPr>
                 <w:sz w:val="18"/>
               </w:rPr>
-              <w:t>Vencimiento en dia no habil</w:t>
+              <w:t>Vencimiento en día no hábil</w:t>
             </w:r>
           </w:p>
         </w:tc>
@@ -7454,7 +7454,7 @@
               <w:rPr>
                 <w:sz w:val="18"/>
               </w:rPr>
-              <w:t>Si el ajuste esta activo, se mueve al siguiente dia habil y se recalculan dias e IDI.</w:t>
+              <w:t>Si el ajuste está activo, se mueve al siguiente día hábil y se recalculan días e IDI.</w:t>
             </w:r>
           </w:p>
         </w:tc>
@@ -7470,7 +7470,7 @@
               <w:rPr>
                 <w:sz w:val="18"/>
               </w:rPr>
-              <w:t>Credito no UVC</w:t>
+              <w:t>Crédito no UVC</w:t>
             </w:r>
           </w:p>
         </w:tc>
@@ -7484,7 +7484,7 @@
               <w:rPr>
                 <w:sz w:val="18"/>
               </w:rPr>
-              <w:t>IDI = 1; sin componentes de actualizacion ni valorizacion; calculo directo en Bs.</w:t>
+              <w:t>IDI = 1; sin componentes de actualización ni valorización; cálculo directo en Bs.</w:t>
             </w:r>
           </w:p>
         </w:tc>
@@ -7500,7 +7500,7 @@
               <w:rPr>
                 <w:sz w:val="18"/>
               </w:rPr>
-              <w:t>Ultima cuota</w:t>
+              <w:t>Última cuota</w:t>
             </w:r>
           </w:p>
         </w:tc>
@@ -7514,7 +7514,7 @@
               <w:rPr>
                 <w:sz w:val="18"/>
               </w:rPr>
-              <w:t>La amortizacion iguala el saldo restante; el saldo cierra en cero.</w:t>
+              <w:t>La amortización iguala el saldo restante; el saldo cierra en cero.</w:t>
             </w:r>
           </w:p>
         </w:tc>
@@ -7563,7 +7563,7 @@
         <w:rPr>
           <w:color w:val="1F3A5F"/>
         </w:rPr>
-        <w:t>24. Resumen de todas las formulas (hoja de referencia)</w:t>
+        <w:t>24. Resumen de todas las fórmulas (hoja de referencia)</w:t>
       </w:r>
     </w:p>
     <w:p>
@@ -7688,7 +7688,7 @@
                 <w:color w:val="FFFFFF"/>
                 <w:sz w:val="19"/>
               </w:rPr>
-              <w:t>Termino</w:t>
+              <w:t>Término</w:t>
             </w:r>
           </w:p>
         </w:tc>
@@ -7705,7 +7705,7 @@
                 <w:color w:val="FFFFFF"/>
                 <w:sz w:val="19"/>
               </w:rPr>
-              <w:t>Definicion</w:t>
+              <w:t>Definición</w:t>
             </w:r>
           </w:p>
         </w:tc>
@@ -7735,7 +7735,7 @@
               <w:rPr>
                 <w:sz w:val="19"/>
               </w:rPr>
-              <w:t>Unidad de Valor de Credito. Unidad de cuenta del BCV para creditos en moneda nacional, que preserva el valor real del capital.</w:t>
+              <w:t>Unidad de Valor de Crédito. Unidad de cuenta del BCV para créditos en moneda nacional, que preserva el valor real del capital.</w:t>
             </w:r>
           </w:p>
         </w:tc>
@@ -7765,7 +7765,7 @@
               <w:rPr>
                 <w:sz w:val="19"/>
               </w:rPr>
-              <w:t>Indice de Inversion. Factor que el BCV publica a diario; indica cuantos bolivares vale una UVC en una fecha.</w:t>
+              <w:t>Índice de Inversión. Factor que el BCV publica a diario; indica cuántos bolívares vale una UVC en una fecha.</w:t>
             </w:r>
           </w:p>
         </w:tc>
@@ -7795,7 +7795,7 @@
               <w:rPr>
                 <w:sz w:val="19"/>
               </w:rPr>
-              <w:t>IDI del dia del desembolso; referencia fija para toda la vida del credito.</w:t>
+              <w:t>IDI del día del desembolso; referencia fija para toda la vida del crédito.</w:t>
             </w:r>
           </w:p>
         </w:tc>
@@ -7811,7 +7811,7 @@
               <w:rPr>
                 <w:sz w:val="19"/>
               </w:rPr>
-              <w:t>Amortizacion</w:t>
+              <w:t>Amortización</w:t>
             </w:r>
           </w:p>
         </w:tc>
@@ -7825,7 +7825,7 @@
               <w:rPr>
                 <w:sz w:val="19"/>
               </w:rPr>
-              <w:t>Porcion de la cuota que abona al capital.</w:t>
+              <w:t>Porción de la cuota que abona al capital.</w:t>
             </w:r>
           </w:p>
         </w:tc>
@@ -7855,7 +7855,7 @@
               <w:rPr>
                 <w:sz w:val="19"/>
               </w:rPr>
-              <w:t>Pago periodico = intereses + amortizacion.</w:t>
+              <w:t>Pago periódico = intereses + amortización.</w:t>
             </w:r>
           </w:p>
         </w:tc>
@@ -7871,7 +7871,7 @@
               <w:rPr>
                 <w:sz w:val="19"/>
               </w:rPr>
-              <w:t>Interes corriente / convencional</w:t>
+              <w:t>Interés corriente / convencional</w:t>
             </w:r>
           </w:p>
         </w:tc>
@@ -7885,7 +7885,7 @@
               <w:rPr>
                 <w:sz w:val="19"/>
               </w:rPr>
-              <w:t>Interes ordinario por el uso del dinero.</w:t>
+              <w:t>Interés ordinario por el uso del dinero.</w:t>
             </w:r>
           </w:p>
         </w:tc>
@@ -7915,7 +7915,7 @@
               <w:rPr>
                 <w:sz w:val="19"/>
               </w:rPr>
-              <w:t>Interes punitorio por atraso, sobre el capital vencido (sin anatocismo).</w:t>
+              <w:t>Interés punitorio por atraso, sobre el capital vencido (sin anatocismo).</w:t>
             </w:r>
           </w:p>
         </w:tc>
@@ -7931,7 +7931,7 @@
               <w:rPr>
                 <w:sz w:val="19"/>
               </w:rPr>
-              <w:t>Dias de gracia</w:t>
+              <w:t>Días de gracia</w:t>
             </w:r>
           </w:p>
         </w:tc>
@@ -7945,7 +7945,7 @@
               <w:rPr>
                 <w:sz w:val="19"/>
               </w:rPr>
-              <w:t>Dias de atraso que no generan mora.</w:t>
+              <w:t>Días de atraso que no generan mora.</w:t>
             </w:r>
           </w:p>
         </w:tc>
@@ -7961,7 +7961,7 @@
               <w:rPr>
                 <w:sz w:val="19"/>
               </w:rPr>
-              <w:t>Base de dias</w:t>
+              <w:t>Base de días</w:t>
             </w:r>
           </w:p>
         </w:tc>
@@ -7975,7 +7975,7 @@
               <w:rPr>
                 <w:sz w:val="19"/>
               </w:rPr>
-              <w:t>Convencion de conteo (30/360 o actual/365) que define el denominador anual.</w:t>
+              <w:t>Convención de conteo (30/360 o actual/365) que define el denominador anual.</w:t>
             </w:r>
           </w:p>
         </w:tc>
@@ -8021,7 +8021,7 @@
               <w:rPr>
                 <w:sz w:val="19"/>
               </w:rPr>
-              <w:t>Componente de variacion</w:t>
+              <w:t>Componente de variación</w:t>
             </w:r>
           </w:p>
         </w:tc>
@@ -8035,7 +8035,7 @@
               <w:rPr>
                 <w:sz w:val="19"/>
               </w:rPr>
-              <w:t>Parte por actualizacion (diferencia entre IDI de vencimiento y de desembolso).</w:t>
+              <w:t>Parte por actualización (diferencia entre IDI de vencimiento y de desembolso).</w:t>
             </w:r>
           </w:p>
         </w:tc>
@@ -8051,7 +8051,7 @@
               <w:rPr>
                 <w:sz w:val="19"/>
               </w:rPr>
-              <w:t>Valorizacion UVC</w:t>
+              <w:t>Valorización UVC</w:t>
             </w:r>
           </w:p>
         </w:tc>
@@ -8095,7 +8095,7 @@
               <w:rPr>
                 <w:sz w:val="19"/>
               </w:rPr>
-              <w:t>Creditos con atraso &lt;= mora2; rendimientos en cuentas de activo.</w:t>
+              <w:t>Créditos con atraso &lt;= mora2; rendimientos en cuentas de activo.</w:t>
             </w:r>
           </w:p>
         </w:tc>
@@ -8125,7 +8125,7 @@
               <w:rPr>
                 <w:sz w:val="19"/>
               </w:rPr>
-              <w:t>Rendimientos y mora de creditos con atraso &gt; mora2; fuera de resultados hasta cobrar.</w:t>
+              <w:t>Rendimientos y mora de créditos con atraso &gt; mora2; fuera de resultados hasta cobrar.</w:t>
             </w:r>
           </w:p>
         </w:tc>
@@ -8155,7 +8155,7 @@
               <w:rPr>
                 <w:sz w:val="19"/>
               </w:rPr>
-              <w:t>El credito vencido deja de actualizarse por IDI en cuentas reales.</w:t>
+              <w:t>El crédito vencido deja de actualizarse por IDI en cuentas reales.</w:t>
             </w:r>
           </w:p>
         </w:tc>
@@ -8185,7 +8185,7 @@
               <w:rPr>
                 <w:sz w:val="19"/>
               </w:rPr>
-              <w:t>En cancelacion anticipada, el IDI no puede ser menor al de otorgamiento.</w:t>
+              <w:t>En cancelación anticipada, el IDI no puede ser menor al de otorgamiento.</w:t>
             </w:r>
           </w:p>
         </w:tc>
@@ -8245,7 +8245,7 @@
               <w:rPr>
                 <w:sz w:val="19"/>
               </w:rPr>
-              <w:t>Tasa Interna de Retorno; rendimiento efectivo del credito para la institucion.</w:t>
+              <w:t>Tasa Interna de Retorno; rendimiento efectivo del crédito para la institución.</w:t>
             </w:r>
           </w:p>
         </w:tc>
@@ -8275,7 +8275,7 @@
               <w:rPr>
                 <w:sz w:val="19"/>
               </w:rPr>
-              <w:t>Fecha de corte en modo simulacion (desembolso + simulationDays).</w:t>
+              <w:t>Fecha de corte en modo simulación (desembolso + simulationDays).</w:t>
             </w:r>
           </w:p>
         </w:tc>
@@ -8354,7 +8354,7 @@
           <w:color w:val="555555"/>
           <w:sz w:val="18"/>
         </w:rPr>
-        <w:t>Documento de uso interno. Verifique la vigencia de las resoluciones del BCV y SUDEBAN antes de implementar en produccion. Las formulas y reglas aqui descritas corresponden al motor de calculo del proyecto (src/lib/simulator.js, regulatory.js y loanStorage.js).</w:t>
+        <w:t>Documento de uso interno. Verifique la vigencia de las resoluciones del BCV y SUDEBAN antes de implementar en producción. Las fórmulas y reglas aquí descritas corresponden al motor de cálculo del proyecto (src/lib/simulator.js, regulatory.js y loanStorage.js).</w:t>
       </w:r>
     </w:p>
     <w:sectPr>

</xml_diff>